<commit_message>
Redesign Augusto as a cinematic multipage hotel site with verified Google assets
</commit_message>
<xml_diff>
--- a/docs/HANDOFF.docx
+++ b/docs/HANDOFF.docx
@@ -26,10 +26,10 @@
       </w:pPr>
       <w:r>
         <w:rPr>
-          <w:color w:val="545459"/>
+          <w:color w:val="596762"/>
           <w:sz w:val="16"/>
         </w:rPr>
-        <w:t>Generated 19 October 2026, 15:46 UTC. Regenerate after final verification or deployment changes.</w:t>
+        <w:t>Generated 19 October 2026, 17:13 UTC. Regenerate after final verification or deployment changes.</w:t>
       </w:r>
     </w:p>
     <w:p>
@@ -99,7 +99,7 @@
         <w:widowControl/>
       </w:pPr>
       <w:r>
-        <w:t>The user's explicit Apple direction governs the current design. Local Inter variable serves display and body text. Near-white and cool gray surfaces, charcoal text, one blue accent, semibold titles, large real photographs, 24–28px corners and capsule actions establish the hierarchy. Mobile layouts use their own crops and room lineup; motion respects reduced-motion preferences.</w:t>
+        <w:t>The current direction combines Apple's clarity with original Awwwards-inspired hospitality composition. Local Manrope display and Inter body fonts, bone surfaces, deep green-black ink and a restrained verdigris accent support an immersive Varanasi photograph, asymmetric property stories and visibly separate pages. Photographs are genuine and destinations are never presented as room views. Mobile uses deliberate crops and vertical room comparisons; motion respects reduced-motion preferences.</w:t>
       </w:r>
     </w:p>
     <w:p>
@@ -107,14 +107,14 @@
         <w:widowControl/>
       </w:pPr>
       <w:r>
-        <w:t xml:space="preserve">Contact uses 56px desktop / 44px mobile page titles, a focused enquiry panel and 48px controls with 16px input text. The current shared theme is authoritative. See </w:t>
+        <w:t xml:space="preserve">The hotel and dining routes have different openings: a street-facing editorial hotel introduction and a full-width restaurant photograph. Contact keeps a focused enquiry panel, 48px controls and 16px input text. See </w:t>
       </w:r>
       <w:hyperlink r:id="rId11">
         <w:r>
           <w:rPr>
-            <w:color w:val="0066CC"/>
+            <w:color w:val="174D47"/>
           </w:rPr>
-          <w:t>Apple design contract</w:t>
+          <w:t>current cinematic direction</w:t>
         </w:r>
       </w:hyperlink>
       <w:r>
@@ -123,13 +123,13 @@
       <w:hyperlink r:id="rId12">
         <w:r>
           <w:rPr>
-            <w:color w:val="0066CC"/>
+            <w:color w:val="174D47"/>
           </w:rPr>
           <w:t>implementation plan</w:t>
         </w:r>
       </w:hyperlink>
       <w:r>
-        <w:t>. The former serif direction is superseded.</w:t>
+        <w:t>. Earlier literal Apple and serif/terracotta directions are historical.</w:t>
       </w:r>
     </w:p>
     <w:p>
@@ -156,6 +156,33 @@
       </w:r>
       <w:r>
         <w:t xml:space="preserve"> — hotel introduction, room selection, dining and Varanasi photography.</w:t>
+      </w:r>
+    </w:p>
+    <w:p>
+      <w:pPr>
+        <w:pStyle w:val="ListBullet"/>
+        <w:widowControl/>
+      </w:pPr>
+      <w:r/>
+      <w:r>
+        <w:rPr>
+          <w:rFonts w:ascii="Consolas" w:hAnsi="Consolas"/>
+          <w:sz w:val="18"/>
+        </w:rPr>
+        <w:t>/hotel</w:t>
+      </w:r>
+      <w:r>
+        <w:t xml:space="preserve"> — the property, reception, facilities and arrival guidance; </w:t>
+      </w:r>
+      <w:r>
+        <w:rPr>
+          <w:rFonts w:ascii="Consolas" w:hAnsi="Consolas"/>
+          <w:sz w:val="18"/>
+        </w:rPr>
+        <w:t>/dining</w:t>
+      </w:r>
+      <w:r>
+        <w:t xml:space="preserve"> — vegetarian restaurant, room service and meal-plan enquiries.</w:t>
       </w:r>
     </w:p>
     <w:p>
@@ -332,7 +359,7 @@
         <w:widowControl/>
       </w:pPr>
       <w:r>
-        <w:t>Research retains 22 source entries covering Google, OTAs, destination authorities and contact verification. The public image set contains 18 WebP files. Property photographs show Hotel Augusto; destination photographs are separately identified. No generated hotel photographs or unrelated room stand-ins are used.</w:t>
+        <w:t>Research retains 22 source entries covering Google, OTAs, destination authorities and contact verification. The public image set contains 22 WebP files. Property photographs show Hotel Augusto; destination photographs are separately identified. No generated hotel photographs or unrelated room stand-ins are used.</w:t>
       </w:r>
     </w:p>
     <w:p>
@@ -350,7 +377,7 @@
         <w:widowControl/>
       </w:pPr>
       <w:r>
-        <w:t xml:space="preserve">Confirm permission to reuse property photographs collected from public hotel listings. Public visibility alone is not a reuse licence. Preserve source originals, hashes and provenance in </w:t>
+        <w:t xml:space="preserve">Confirm permission to reuse property photographs collected from public hotel listings. Public visibility alone is not a reuse licence. Preserve originals, hashes and provenance in </w:t>
       </w:r>
       <w:r>
         <w:rPr>
@@ -360,7 +387,17 @@
         <w:t>research/assets/</w:t>
       </w:r>
       <w:r>
-        <w:t>.</w:t>
+        <w:t xml:space="preserve"> and </w:t>
+      </w:r>
+      <w:r>
+        <w:rPr>
+          <w:rFonts w:ascii="Consolas" w:hAnsi="Consolas"/>
+          <w:sz w:val="18"/>
+        </w:rPr>
+        <w:t>research/ota-revision/</w:t>
+      </w:r>
+      <w:r>
+        <w:t>; Google uploader display names alone do not establish copyright ownership.</w:t>
       </w:r>
     </w:p>
     <w:p>
@@ -401,7 +438,7 @@
       <w:hyperlink r:id="rId13">
         <w:r>
           <w:rPr>
-            <w:color w:val="0066CC"/>
+            <w:color w:val="174D47"/>
           </w:rPr>
           <w:t>fact sheet</w:t>
         </w:r>
@@ -412,7 +449,7 @@
       <w:hyperlink r:id="rId14">
         <w:r>
           <w:rPr>
-            <w:color w:val="0066CC"/>
+            <w:color w:val="174D47"/>
           </w:rPr>
           <w:t>source ledger</w:t>
         </w:r>
@@ -423,7 +460,7 @@
       <w:hyperlink r:id="rId15">
         <w:r>
           <w:rPr>
-            <w:color w:val="0066CC"/>
+            <w:color w:val="174D47"/>
           </w:rPr>
           <w:t>asset manifest</w:t>
         </w:r>
@@ -434,7 +471,7 @@
       <w:hyperlink r:id="rId16">
         <w:r>
           <w:rPr>
-            <w:color w:val="0066CC"/>
+            <w:color w:val="174D47"/>
           </w:rPr>
           <w:t>Maps verification</w:t>
         </w:r>
@@ -445,13 +482,54 @@
       <w:hyperlink r:id="rId17">
         <w:r>
           <w:rPr>
-            <w:color w:val="0066CC"/>
+            <w:color w:val="174D47"/>
           </w:rPr>
           <w:t>WhatsApp verification</w:t>
         </w:r>
       </w:hyperlink>
       <w:r>
         <w:t>. Research documents also have DOCX twins.</w:t>
+      </w:r>
+    </w:p>
+    <w:p>
+      <w:pPr>
+        <w:widowControl/>
+      </w:pPr>
+      <w:r>
+        <w:t xml:space="preserve">The user-supplied MakeMyTrip dated route was tried in a fresh browser and returned an HTTP/2 transport error. The canonical indexed MMT property page corroborates the address, room categories and vegetarian dining; it does not verify live dated availability. Google’s rendered profile and eight accessible still-photo entries were inspected, and three additional real property photographs were collected. See </w:t>
+      </w:r>
+      <w:hyperlink r:id="rId18">
+        <w:r>
+          <w:rPr>
+            <w:color w:val="174D47"/>
+          </w:rPr>
+          <w:t>OTA revision record</w:t>
+        </w:r>
+      </w:hyperlink>
+      <w:r>
+        <w:t xml:space="preserve">, </w:t>
+      </w:r>
+      <w:hyperlink r:id="rId19">
+        <w:r>
+          <w:rPr>
+            <w:color w:val="174D47"/>
+          </w:rPr>
+          <w:t>source-to-page mapping</w:t>
+        </w:r>
+      </w:hyperlink>
+      <w:r>
+        <w:t xml:space="preserve"> and </w:t>
+      </w:r>
+      <w:hyperlink r:id="rId20">
+        <w:r>
+          <w:rPr>
+            <w:color w:val="174D47"/>
+          </w:rPr>
+          <w:t>new asset ledger</w:t>
+        </w:r>
+      </w:hyperlink>
+      <w:r>
+        <w:t>.</w:t>
       </w:r>
     </w:p>
     <w:p>
@@ -689,26 +767,26 @@
       <w:r>
         <w:t xml:space="preserve">Latest completed shared report: </w:t>
       </w:r>
-      <w:hyperlink r:id="rId18">
+      <w:hyperlink r:id="rId21">
         <w:r>
           <w:rPr>
-            <w:color w:val="0066CC"/>
+            <w:color w:val="174D47"/>
           </w:rPr>
-          <w:t>evidence/qa-production-report.json</w:t>
+          <w:t>evidence/qa-hospitality-production.json</w:t>
         </w:r>
       </w:hyperlink>
       <w:r>
-        <w:t xml:space="preserve">, completed 2026-10-19T15:45:10.972421+00:00 against </w:t>
+        <w:t xml:space="preserve">, completed 2026-10-19T17:12:30.784614+00:00 against </w:t>
       </w:r>
       <w:r>
         <w:rPr>
           <w:rFonts w:ascii="Consolas" w:hAnsi="Consolas"/>
           <w:sz w:val="18"/>
         </w:rPr>
-        <w:t>http://127.0.0.1:3081</w:t>
+        <w:t>http://127.0.0.1:3080</w:t>
       </w:r>
       <w:r>
-        <w:t>. Status: PASS. It records 20 viewport checks, 20 axe audits, 48 interaction checks and 0 failures. These are report counts, not a claim that an unrecorded final run passed.</w:t>
+        <w:t>. Status: PASS. It records 24 viewport checks, 24 axe audits, 66 interaction checks and 0 failures. These are report counts, not a claim that an unrecorded final run passed.</w:t>
       </w:r>
     </w:p>
     <w:p>
@@ -716,14 +794,25 @@
         <w:widowControl/>
       </w:pPr>
       <w:r>
-        <w:t xml:space="preserve">Contact/privacy redesign review: 8 route/viewport records at 320, 390, 768, 1440px; layout/image/runtime checks pass. The report also records FAQ keyboard behavior, validation, room preselection and the prepared WhatsApp draft: </w:t>
+        <w:t xml:space="preserve">Dedicated hotel/dining review: 4 route/viewport records at 390, 1440px; layout/image/runtime checks pass. All four full-page screenshots were inspected; the later Google dining photograph also passed both widths. Evidence: </w:t>
       </w:r>
-      <w:hyperlink r:id="rId19">
+      <w:hyperlink r:id="rId22">
         <w:r>
           <w:rPr>
-            <w:color w:val="0066CC"/>
+            <w:color w:val="174D47"/>
           </w:rPr>
-          <w:t>contact review</w:t>
+          <w:t>page review</w:t>
+        </w:r>
+      </w:hyperlink>
+      <w:r>
+        <w:t xml:space="preserve"> and </w:t>
+      </w:r>
+      <w:hyperlink r:id="rId23">
+        <w:r>
+          <w:rPr>
+            <w:color w:val="174D47"/>
+          </w:rPr>
+          <w:t>final photo check</w:t>
         </w:r>
       </w:hyperlink>
       <w:r>
@@ -735,14 +824,14 @@
         <w:widowControl/>
       </w:pPr>
       <w:r>
-        <w:t xml:space="preserve">Additional visual evidence: </w:t>
+        <w:t xml:space="preserve">Current visual evidence: </w:t>
       </w:r>
       <w:r>
         <w:rPr>
           <w:rFonts w:ascii="Consolas" w:hAnsi="Consolas"/>
           <w:sz w:val="18"/>
         </w:rPr>
-        <w:t>evidence/apple-design/</w:t>
+        <w:t>research/awwwards-revision/live-inspection.json</w:t>
       </w:r>
       <w:r>
         <w:t xml:space="preserve">, </w:t>
@@ -752,20 +841,20 @@
           <w:rFonts w:ascii="Consolas" w:hAnsi="Consolas"/>
           <w:sz w:val="18"/>
         </w:rPr>
-        <w:t>evidence/apple-room-*.png</w:t>
+        <w:t>research/design-qa/cinematic-redesign/verification.json</w:t>
       </w:r>
       <w:r>
-        <w:t xml:space="preserve">, and </w:t>
+        <w:t xml:space="preserve"> and </w:t>
       </w:r>
       <w:r>
         <w:rPr>
           <w:rFonts w:ascii="Consolas" w:hAnsi="Consolas"/>
           <w:sz w:val="18"/>
         </w:rPr>
-        <w:t>research/design-qa/apple-redesign/verification.json</w:t>
+        <w:t>evidence/hospitality-review/</w:t>
       </w:r>
       <w:r>
-        <w:t>. Earlier QA files are retained as investigation history; use the latest completed report and its remaining failures. Browser checks do not establish hotel policy accuracy or photo rights.</w:t>
+        <w:t>. Earlier Apple QA files are investigation history; use the latest completed report and its remaining failures. Browser checks do not establish hotel policy accuracy or photo rights.</w:t>
       </w:r>
     </w:p>
     <w:p>
@@ -775,10 +864,10 @@
       <w:r>
         <w:t xml:space="preserve">Release evidence: </w:t>
       </w:r>
-      <w:hyperlink r:id="rId20">
+      <w:hyperlink r:id="rId24">
         <w:r>
           <w:rPr>
-            <w:color w:val="0066CC"/>
+            <w:color w:val="174D47"/>
           </w:rPr>
           <w:t>production audit</w:t>
         </w:r>
@@ -786,10 +875,10 @@
       <w:r>
         <w:t xml:space="preserve">, </w:t>
       </w:r>
-      <w:hyperlink r:id="rId21">
+      <w:hyperlink r:id="rId25">
         <w:r>
           <w:rPr>
-            <w:color w:val="0066CC"/>
+            <w:color w:val="174D47"/>
           </w:rPr>
           <w:t>scoped storage cleanup</w:t>
         </w:r>
@@ -797,16 +886,54 @@
       <w:r>
         <w:t xml:space="preserve">, and </w:t>
       </w:r>
-      <w:hyperlink r:id="rId22">
+      <w:hyperlink r:id="rId26">
         <w:r>
           <w:rPr>
-            <w:color w:val="0066CC"/>
+            <w:color w:val="174D47"/>
           </w:rPr>
           <w:t>inactive development output cleanup</w:t>
         </w:r>
       </w:hyperlink>
       <w:r>
-        <w:t>. The development cleanup records 285,706,683 bytes removed after stopping the dev session; production was verified afterwards. The local preview remains noindex. An approved public domain and route canonical configuration still require launch verification.</w:t>
+        <w:t>. The development cleanup records 246,218,803 bytes removed after stopping the dev session; production was verified afterwards. The local preview remains noindex. An approved public domain and route canonical configuration still require launch verification.</w:t>
+      </w:r>
+    </w:p>
+    <w:p>
+      <w:pPr>
+        <w:widowControl/>
+      </w:pPr>
+      <w:r>
+        <w:t xml:space="preserve">Render-cleanup limitation: automatic approval review rejected removal of the verified OTA-document render scratch with the reason 'blocked by policy'. Its 447,116 bytes remain under </w:t>
+      </w:r>
+      <w:r>
+        <w:rPr>
+          <w:rFonts w:ascii="Consolas" w:hAnsi="Consolas"/>
+          <w:sz w:val="18"/>
+        </w:rPr>
+        <w:t>research/ota-revision/.document-review/</w:t>
+      </w:r>
+      <w:r>
+        <w:t xml:space="preserve">; no further removal was attempted. The retained source twins and scratch hashes are recorded in </w:t>
+      </w:r>
+      <w:r>
+        <w:rPr>
+          <w:rFonts w:ascii="Consolas" w:hAnsi="Consolas"/>
+          <w:sz w:val="18"/>
+        </w:rPr>
+        <w:t>research/ota-revision/source-review-verification.json</w:t>
+      </w:r>
+      <w:r>
+        <w:t xml:space="preserve">. Final handoff render evidence is retained with </w:t>
+      </w:r>
+      <w:r>
+        <w:rPr>
+          <w:rFonts w:ascii="Consolas" w:hAnsi="Consolas"/>
+          <w:sz w:val="18"/>
+        </w:rPr>
+        <w:t>docs/handoff-verification.json</w:t>
+      </w:r>
+      <w:r>
+        <w:t>.</w:t>
       </w:r>
     </w:p>
     <w:p>
@@ -825,10 +952,10 @@
       <w:r>
         <w:t xml:space="preserve">The recorded production dependency audit has 0 vulnerabilities. The full audit records 5 high findings from one development-only ESLint chain ending in braces 3.0.3. </w:t>
       </w:r>
-      <w:hyperlink r:id="rId23">
+      <w:hyperlink r:id="rId27">
         <w:r>
           <w:rPr>
-            <w:color w:val="0066CC"/>
+            <w:color w:val="174D47"/>
           </w:rPr>
           <w:t>GHSA-vfj7-8cjw-p6xm</w:t>
         </w:r>
@@ -836,10 +963,10 @@
       <w:r>
         <w:t xml:space="preserve"> had no official patched release at the 19 October 2026 review. Keep the lockfile, recheck upstream and do not force-downgrade Next.js to silence it. Details: </w:t>
       </w:r>
-      <w:hyperlink r:id="rId24">
+      <w:hyperlink r:id="rId28">
         <w:r>
           <w:rPr>
-            <w:color w:val="0066CC"/>
+            <w:color w:val="174D47"/>
           </w:rPr>
           <w:t>security review</w:t>
         </w:r>
@@ -872,67 +999,23 @@
       <w:r>
         <w:t xml:space="preserve">Design: </w:t>
       </w:r>
-      <w:hyperlink r:id="rId25">
+      <w:hyperlink r:id="rId29">
         <w:r>
           <w:rPr>
-            <w:color w:val="0066CC"/>
+            <w:color w:val="174D47"/>
           </w:rPr>
-          <w:t>Apple iPhone</w:t>
+          <w:t>The Drake on Awwwards</w:t>
         </w:r>
       </w:hyperlink>
       <w:r>
         <w:t xml:space="preserve">, </w:t>
       </w:r>
-      <w:hyperlink r:id="rId26">
-        <w:r>
-          <w:rPr>
-            <w:color w:val="0066CC"/>
-          </w:rPr>
-          <w:t>MacBook Pro</w:t>
-        </w:r>
-      </w:hyperlink>
-      <w:r>
-        <w:t xml:space="preserve">, </w:t>
-      </w:r>
-      <w:hyperlink r:id="rId27">
-        <w:r>
-          <w:rPr>
-            <w:color w:val="0066CC"/>
-          </w:rPr>
-          <w:t>HIG typography</w:t>
-        </w:r>
-      </w:hyperlink>
-      <w:r>
-        <w:t xml:space="preserve">. Destination facts: </w:t>
-      </w:r>
-      <w:hyperlink r:id="rId28">
-        <w:r>
-          <w:rPr>
-            <w:color w:val="0066CC"/>
-          </w:rPr>
-          <w:t>Kashi Vishwanath</w:t>
-        </w:r>
-      </w:hyperlink>
-      <w:r>
-        <w:t xml:space="preserve">, </w:t>
-      </w:r>
-      <w:hyperlink r:id="rId29">
-        <w:r>
-          <w:rPr>
-            <w:color w:val="0066CC"/>
-          </w:rPr>
-          <w:t>Dashashwamedh Ghat</w:t>
-        </w:r>
-      </w:hyperlink>
-      <w:r>
-        <w:t xml:space="preserve">. Image credit: </w:t>
-      </w:r>
       <w:hyperlink r:id="rId30">
         <w:r>
           <w:rPr>
-            <w:color w:val="0066CC"/>
+            <w:color w:val="174D47"/>
           </w:rPr>
-          <w:t>Pradum Shukla's temple photograph</w:t>
+          <w:t>Kaskady on Awwwards</w:t>
         </w:r>
       </w:hyperlink>
       <w:r>
@@ -941,9 +1024,9 @@
       <w:hyperlink r:id="rId31">
         <w:r>
           <w:rPr>
-            <w:color w:val="0066CC"/>
+            <w:color w:val="174D47"/>
           </w:rPr>
-          <w:t>CC BY 4.0</w:t>
+          <w:t>Casa Cook on Awwwards</w:t>
         </w:r>
       </w:hyperlink>
       <w:r>
@@ -952,7 +1035,73 @@
       <w:hyperlink r:id="rId32">
         <w:r>
           <w:rPr>
-            <w:color w:val="0066CC"/>
+            <w:color w:val="174D47"/>
+          </w:rPr>
+          <w:t>Apple typography</w:t>
+        </w:r>
+      </w:hyperlink>
+      <w:r>
+        <w:t xml:space="preserve">. Property: </w:t>
+      </w:r>
+      <w:hyperlink r:id="rId33">
+        <w:r>
+          <w:rPr>
+            <w:color w:val="174D47"/>
+          </w:rPr>
+          <w:t>MakeMyTrip Hotel Augusto</w:t>
+        </w:r>
+      </w:hyperlink>
+      <w:r>
+        <w:t xml:space="preserve">. Destination: </w:t>
+      </w:r>
+      <w:hyperlink r:id="rId34">
+        <w:r>
+          <w:rPr>
+            <w:color w:val="174D47"/>
+          </w:rPr>
+          <w:t>Kashi Vishwanath</w:t>
+        </w:r>
+      </w:hyperlink>
+      <w:r>
+        <w:t xml:space="preserve">, </w:t>
+      </w:r>
+      <w:hyperlink r:id="rId35">
+        <w:r>
+          <w:rPr>
+            <w:color w:val="174D47"/>
+          </w:rPr>
+          <w:t>Dashashwamedh Ghat</w:t>
+        </w:r>
+      </w:hyperlink>
+      <w:r>
+        <w:t xml:space="preserve">. Credits: </w:t>
+      </w:r>
+      <w:hyperlink r:id="rId36">
+        <w:r>
+          <w:rPr>
+            <w:color w:val="174D47"/>
+          </w:rPr>
+          <w:t>Pradum Shukla temple photo</w:t>
+        </w:r>
+      </w:hyperlink>
+      <w:r>
+        <w:t xml:space="preserve">, </w:t>
+      </w:r>
+      <w:hyperlink r:id="rId37">
+        <w:r>
+          <w:rPr>
+            <w:color w:val="174D47"/>
+          </w:rPr>
+          <w:t>CC BY 4.0</w:t>
+        </w:r>
+      </w:hyperlink>
+      <w:r>
+        <w:t xml:space="preserve">, </w:t>
+      </w:r>
+      <w:hyperlink r:id="rId38">
+        <w:r>
+          <w:rPr>
+            <w:color w:val="174D47"/>
           </w:rPr>
           <w:t>Unsplash licence</w:t>
         </w:r>
@@ -967,7 +1116,7 @@
       </w:pPr>
       <w:r>
         <w:rPr>
-          <w:color w:val="545459"/>
+          <w:color w:val="596762"/>
           <w:sz w:val="16"/>
         </w:rPr>
         <w:t>Regenerate both handoff files with: python scripts/generate_handoff.py. The generator uses python-docx and verifies that its DOCX can be reopened.</w:t>
@@ -1011,7 +1160,7 @@
     </w:pPr>
     <w:r>
       <w:rPr>
-        <w:color w:val="545459"/>
+        <w:color w:val="596762"/>
         <w:sz w:val="16"/>
       </w:rPr>
       <w:t>DIGIOCULAR  /  HOTEL AUGUSTO</w:t>
@@ -1388,7 +1537,7 @@
     </w:pPr>
     <w:rPr>
       <w:rFonts w:ascii="Arial" w:hAnsi="Arial"/>
-      <w:color w:val="1D1D1F"/>
+      <w:color w:val="162A27"/>
       <w:sz w:val="21"/>
     </w:rPr>
   </w:style>
@@ -1454,7 +1603,7 @@
       <w:rFonts w:asciiTheme="majorHAnsi" w:eastAsiaTheme="majorEastAsia" w:hAnsiTheme="majorHAnsi" w:cstheme="majorBidi" w:ascii="Arial" w:hAnsi="Arial"/>
       <w:b/>
       <w:bCs/>
-      <w:color w:val="1D1D1F"/>
+      <w:color w:val="162A27"/>
       <w:sz w:val="28"/>
       <w:szCs w:val="28"/>
     </w:rPr>
@@ -1742,7 +1891,7 @@
     <w:rPr>
       <w:rFonts w:asciiTheme="majorHAnsi" w:eastAsiaTheme="majorEastAsia" w:hAnsiTheme="majorHAnsi" w:cstheme="majorBidi" w:ascii="Arial" w:hAnsi="Arial"/>
       <w:b/>
-      <w:color w:val="1D1D1F"/>
+      <w:color w:val="162A27"/>
       <w:spacing w:val="5"/>
       <w:kern w:val="28"/>
       <w:sz w:val="60"/>
@@ -1781,7 +1930,7 @@
       <w:rFonts w:asciiTheme="majorHAnsi" w:eastAsiaTheme="majorEastAsia" w:hAnsiTheme="majorHAnsi" w:cstheme="majorBidi" w:ascii="Arial" w:hAnsi="Arial"/>
       <w:i w:val="0"/>
       <w:iCs/>
-      <w:color w:val="1D1D1F"/>
+      <w:color w:val="162A27"/>
       <w:spacing w:val="15"/>
       <w:sz w:val="26"/>
       <w:szCs w:val="24"/>
@@ -1923,7 +2072,7 @@
     </w:pPr>
     <w:rPr>
       <w:rFonts w:ascii="Arial" w:hAnsi="Arial"/>
-      <w:color w:val="1D1D1F"/>
+      <w:color w:val="162A27"/>
     </w:rPr>
   </w:style>
   <w:style w:type="paragraph" w:styleId="ListBullet2">

</xml_diff>

<commit_message>
Enlarge Apple-inspired hotel design and add accessible scroll motion
</commit_message>
<xml_diff>
--- a/docs/HANDOFF.docx
+++ b/docs/HANDOFF.docx
@@ -26,10 +26,10 @@
       </w:pPr>
       <w:r>
         <w:rPr>
-          <w:color w:val="596762"/>
+          <w:color w:val="565B65"/>
           <w:sz w:val="16"/>
         </w:rPr>
-        <w:t>Generated 19 October 2026, 17:13 UTC. Regenerate after final verification or deployment changes.</w:t>
+        <w:t>Generated 20 October 2026, 05:25 UTC. Regenerate after final verification or deployment changes.</w:t>
       </w:r>
     </w:p>
     <w:p>
@@ -99,7 +99,7 @@
         <w:widowControl/>
       </w:pPr>
       <w:r>
-        <w:t>The current direction combines Apple's clarity with original Awwwards-inspired hospitality composition. Local Manrope display and Inter body fonts, bone surfaces, deep green-black ink and a restrained verdigris accent support an immersive Varanasi photograph, asymmetric property stories and visibly separate pages. Photographs are genuine and destinations are never presented as room views. Mobile uses deliberate crops and vertical room comparisons; motion respects reduced-motion preferences.</w:t>
+        <w:t>The 20 October correction restores the Apple-inspired foundation the user explicitly liked, now larger and more animated. Local Manrope display at weight 650 and Inter body, pearl surfaces, charcoal text and a restrained blue accent support large real photographs, generous spacing and rounded panels. Interior titles reach roughly 80–104px on desktop and 52–64px on mobile, with 18px desktop / 17px mobile body copy and readable labels. All 11 pages and the improved Varanasi hero remain.</w:t>
       </w:r>
     </w:p>
     <w:p>
@@ -107,14 +107,14 @@
         <w:widowControl/>
       </w:pPr>
       <w:r>
-        <w:t xml:space="preserve">The hotel and dining routes have different openings: a street-facing editorial hotel introduction and a full-width restaurant photograph. Contact keeps a focused enquiry panel, 48px controls and 16px input text. See </w:t>
+        <w:t xml:space="preserve">Hotel and dining retain their distinct compositions. Photography and form panels use soft 24–32px corners; primary actions and enquiry controls are approximately 56px desktop / 50px mobile. Contact fields stay at 17px or larger on mobile. Visible entrance and scroll motion respect reduced-motion preferences and native scrolling. See </w:t>
       </w:r>
       <w:hyperlink r:id="rId11">
         <w:r>
           <w:rPr>
-            <w:color w:val="174D47"/>
+            <w:color w:val="0066CC"/>
           </w:rPr>
-          <w:t>current cinematic direction</w:t>
+          <w:t>current Apple premium contract</w:t>
         </w:r>
       </w:hyperlink>
       <w:r>
@@ -123,13 +123,13 @@
       <w:hyperlink r:id="rId12">
         <w:r>
           <w:rPr>
-            <w:color w:val="174D47"/>
+            <w:color w:val="0066CC"/>
           </w:rPr>
           <w:t>implementation plan</w:t>
         </w:r>
       </w:hyperlink>
       <w:r>
-        <w:t>. Earlier literal Apple and serif/terracotta directions are historical.</w:t>
+        <w:t>. The previous verdigris and smaller Apple revisions remain historical references.</w:t>
       </w:r>
     </w:p>
     <w:p>
@@ -438,7 +438,7 @@
       <w:hyperlink r:id="rId13">
         <w:r>
           <w:rPr>
-            <w:color w:val="174D47"/>
+            <w:color w:val="0066CC"/>
           </w:rPr>
           <w:t>fact sheet</w:t>
         </w:r>
@@ -449,7 +449,7 @@
       <w:hyperlink r:id="rId14">
         <w:r>
           <w:rPr>
-            <w:color w:val="174D47"/>
+            <w:color w:val="0066CC"/>
           </w:rPr>
           <w:t>source ledger</w:t>
         </w:r>
@@ -460,7 +460,7 @@
       <w:hyperlink r:id="rId15">
         <w:r>
           <w:rPr>
-            <w:color w:val="174D47"/>
+            <w:color w:val="0066CC"/>
           </w:rPr>
           <w:t>asset manifest</w:t>
         </w:r>
@@ -471,7 +471,7 @@
       <w:hyperlink r:id="rId16">
         <w:r>
           <w:rPr>
-            <w:color w:val="174D47"/>
+            <w:color w:val="0066CC"/>
           </w:rPr>
           <w:t>Maps verification</w:t>
         </w:r>
@@ -482,7 +482,7 @@
       <w:hyperlink r:id="rId17">
         <w:r>
           <w:rPr>
-            <w:color w:val="174D47"/>
+            <w:color w:val="0066CC"/>
           </w:rPr>
           <w:t>WhatsApp verification</w:t>
         </w:r>
@@ -501,7 +501,7 @@
       <w:hyperlink r:id="rId18">
         <w:r>
           <w:rPr>
-            <w:color w:val="174D47"/>
+            <w:color w:val="0066CC"/>
           </w:rPr>
           <w:t>OTA revision record</w:t>
         </w:r>
@@ -512,7 +512,7 @@
       <w:hyperlink r:id="rId19">
         <w:r>
           <w:rPr>
-            <w:color w:val="174D47"/>
+            <w:color w:val="0066CC"/>
           </w:rPr>
           <w:t>source-to-page mapping</w:t>
         </w:r>
@@ -523,7 +523,7 @@
       <w:hyperlink r:id="rId20">
         <w:r>
           <w:rPr>
-            <w:color w:val="174D47"/>
+            <w:color w:val="0066CC"/>
           </w:rPr>
           <w:t>new asset ledger</w:t>
         </w:r>
@@ -770,13 +770,13 @@
       <w:hyperlink r:id="rId21">
         <w:r>
           <w:rPr>
-            <w:color w:val="174D47"/>
+            <w:color w:val="0066CC"/>
           </w:rPr>
-          <w:t>evidence/qa-hospitality-production.json</w:t>
+          <w:t>evidence/qa-apple-premium-production.json</w:t>
         </w:r>
       </w:hyperlink>
       <w:r>
-        <w:t xml:space="preserve">, completed 2026-10-19T17:12:30.784614+00:00 against </w:t>
+        <w:t xml:space="preserve">, completed 2026-10-20T05:23:43.863633+00:00 against </w:t>
       </w:r>
       <w:r>
         <w:rPr>
@@ -786,7 +786,7 @@
         <w:t>http://127.0.0.1:3080</w:t>
       </w:r>
       <w:r>
-        <w:t>. Status: PASS. It records 24 viewport checks, 24 axe audits, 66 interaction checks and 0 failures. These are report counts, not a claim that an unrecorded final run passed.</w:t>
+        <w:t>. Status: PASS. It records 72 viewport checks, 24 axe audits, 76 interaction checks and 0 failures. These are report counts, not a claim that an unrecorded final run passed.</w:t>
       </w:r>
     </w:p>
     <w:p>
@@ -794,25 +794,22 @@
         <w:widowControl/>
       </w:pPr>
       <w:r>
-        <w:t xml:space="preserve">Dedicated hotel/dining review: 4 route/viewport records at 390, 1440px; layout/image/runtime checks pass. All four full-page screenshots were inspected; the later Google dining photograph also passed both widths. Evidence: </w:t>
+        <w:t>The initial report recorded 1 failed automated check. The final report includes 3 targeted keyboard-link retests using a 1px outer-edge rounding tolerance and fully visible text bounds. The original run, retest evidence and timestamps remain preserved in that report; no application change was required between those runs.</w:t>
+      </w:r>
+    </w:p>
+    <w:p>
+      <w:pPr>
+        <w:widowControl/>
+      </w:pPr>
+      <w:r>
+        <w:t xml:space="preserve">Focused hotel, dining, contact and privacy review: 8 route/viewport records at 390, 1440px; layout/image/runtime checks pass. The rendered screenshots were inspected for type scale, image framing and control alignment. Evidence: </w:t>
       </w:r>
       <w:hyperlink r:id="rId22">
         <w:r>
           <w:rPr>
-            <w:color w:val="174D47"/>
+            <w:color w:val="0066CC"/>
           </w:rPr>
           <w:t>page review</w:t>
-        </w:r>
-      </w:hyperlink>
-      <w:r>
-        <w:t xml:space="preserve"> and </w:t>
-      </w:r>
-      <w:hyperlink r:id="rId23">
-        <w:r>
-          <w:rPr>
-            <w:color w:val="174D47"/>
-          </w:rPr>
-          <w:t>final photo check</w:t>
         </w:r>
       </w:hyperlink>
       <w:r>
@@ -824,37 +821,37 @@
         <w:widowControl/>
       </w:pPr>
       <w:r>
-        <w:t xml:space="preserve">Current visual evidence: </w:t>
+        <w:t xml:space="preserve">Current revision evidence is in </w:t>
       </w:r>
       <w:r>
         <w:rPr>
           <w:rFonts w:ascii="Consolas" w:hAnsi="Consolas"/>
           <w:sz w:val="18"/>
         </w:rPr>
-        <w:t>research/awwwards-revision/live-inspection.json</w:t>
+        <w:t>evidence/apple-premium/</w:t>
       </w:r>
       <w:r>
-        <w:t xml:space="preserve">, </w:t>
+        <w:t xml:space="preserve">; the intended final report is </w:t>
       </w:r>
       <w:r>
         <w:rPr>
           <w:rFonts w:ascii="Consolas" w:hAnsi="Consolas"/>
           <w:sz w:val="18"/>
         </w:rPr>
-        <w:t>research/design-qa/cinematic-redesign/verification.json</w:t>
+        <w:t>evidence/qa-apple-premium-production.json</w:t>
       </w:r>
       <w:r>
-        <w:t xml:space="preserve"> and </w:t>
+        <w:t xml:space="preserve">. Earlier Apple/cinematic reports and </w:t>
       </w:r>
       <w:r>
         <w:rPr>
           <w:rFonts w:ascii="Consolas" w:hAnsi="Consolas"/>
           <w:sz w:val="18"/>
         </w:rPr>
-        <w:t>evidence/hospitality-review/</w:t>
+        <w:t>research/awwwards-revision/</w:t>
       </w:r>
       <w:r>
-        <w:t>. Earlier Apple QA files are investigation history; use the latest completed report and its remaining failures. Browser checks do not establish hotel policy accuracy or photo rights.</w:t>
+        <w:t xml:space="preserve"> remain reference history. Use the latest completed report and its remaining failures; earlier passes do not certify later edits. Browser checks do not establish hotel policy accuracy or photo rights.</w:t>
       </w:r>
     </w:p>
     <w:p>
@@ -864,10 +861,10 @@
       <w:r>
         <w:t xml:space="preserve">Release evidence: </w:t>
       </w:r>
-      <w:hyperlink r:id="rId24">
+      <w:hyperlink r:id="rId23">
         <w:r>
           <w:rPr>
-            <w:color w:val="174D47"/>
+            <w:color w:val="0066CC"/>
           </w:rPr>
           <w:t>production audit</w:t>
         </w:r>
@@ -875,10 +872,10 @@
       <w:r>
         <w:t xml:space="preserve">, </w:t>
       </w:r>
-      <w:hyperlink r:id="rId25">
+      <w:hyperlink r:id="rId24">
         <w:r>
           <w:rPr>
-            <w:color w:val="174D47"/>
+            <w:color w:val="0066CC"/>
           </w:rPr>
           <w:t>scoped storage cleanup</w:t>
         </w:r>
@@ -886,16 +883,16 @@
       <w:r>
         <w:t xml:space="preserve">, and </w:t>
       </w:r>
-      <w:hyperlink r:id="rId26">
+      <w:hyperlink r:id="rId25">
         <w:r>
           <w:rPr>
-            <w:color w:val="174D47"/>
+            <w:color w:val="0066CC"/>
           </w:rPr>
           <w:t>inactive development output cleanup</w:t>
         </w:r>
       </w:hyperlink>
       <w:r>
-        <w:t>. The development cleanup records 246,218,803 bytes removed after stopping the dev session; production was verified afterwards. The local preview remains noindex. An approved public domain and route canonical configuration still require launch verification.</w:t>
+        <w:t>. The development cleanup records 240,653,234 bytes removed after stopping the dev session; production was verified afterwards. The local preview remains noindex. An approved public domain and route canonical configuration still require launch verification.</w:t>
       </w:r>
     </w:p>
     <w:p>
@@ -952,10 +949,10 @@
       <w:r>
         <w:t xml:space="preserve">The recorded production dependency audit has 0 vulnerabilities. The full audit records 5 high findings from one development-only ESLint chain ending in braces 3.0.3. </w:t>
       </w:r>
-      <w:hyperlink r:id="rId27">
+      <w:hyperlink r:id="rId26">
         <w:r>
           <w:rPr>
-            <w:color w:val="174D47"/>
+            <w:color w:val="0066CC"/>
           </w:rPr>
           <w:t>GHSA-vfj7-8cjw-p6xm</w:t>
         </w:r>
@@ -963,10 +960,10 @@
       <w:r>
         <w:t xml:space="preserve"> had no official patched release at the 19 October 2026 review. Keep the lockfile, recheck upstream and do not force-downgrade Next.js to silence it. Details: </w:t>
       </w:r>
-      <w:hyperlink r:id="rId28">
+      <w:hyperlink r:id="rId27">
         <w:r>
           <w:rPr>
-            <w:color w:val="174D47"/>
+            <w:color w:val="0066CC"/>
           </w:rPr>
           <w:t>security review</w:t>
         </w:r>
@@ -999,12 +996,23 @@
       <w:r>
         <w:t xml:space="preserve">Design: </w:t>
       </w:r>
+      <w:hyperlink r:id="rId28">
+        <w:r>
+          <w:rPr>
+            <w:color w:val="0066CC"/>
+          </w:rPr>
+          <w:t>The Drake on Awwwards</w:t>
+        </w:r>
+      </w:hyperlink>
+      <w:r>
+        <w:t xml:space="preserve">, </w:t>
+      </w:r>
       <w:hyperlink r:id="rId29">
         <w:r>
           <w:rPr>
-            <w:color w:val="174D47"/>
+            <w:color w:val="0066CC"/>
           </w:rPr>
-          <w:t>The Drake on Awwwards</w:t>
+          <w:t>Kaskady on Awwwards</w:t>
         </w:r>
       </w:hyperlink>
       <w:r>
@@ -1013,9 +1021,9 @@
       <w:hyperlink r:id="rId30">
         <w:r>
           <w:rPr>
-            <w:color w:val="174D47"/>
+            <w:color w:val="0066CC"/>
           </w:rPr>
-          <w:t>Kaskady on Awwwards</w:t>
+          <w:t>Casa Cook on Awwwards</w:t>
         </w:r>
       </w:hyperlink>
       <w:r>
@@ -1024,18 +1032,7 @@
       <w:hyperlink r:id="rId31">
         <w:r>
           <w:rPr>
-            <w:color w:val="174D47"/>
-          </w:rPr>
-          <w:t>Casa Cook on Awwwards</w:t>
-        </w:r>
-      </w:hyperlink>
-      <w:r>
-        <w:t xml:space="preserve">, </w:t>
-      </w:r>
-      <w:hyperlink r:id="rId32">
-        <w:r>
-          <w:rPr>
-            <w:color w:val="174D47"/>
+            <w:color w:val="0066CC"/>
           </w:rPr>
           <w:t>Apple typography</w:t>
         </w:r>
@@ -1043,10 +1040,10 @@
       <w:r>
         <w:t xml:space="preserve">. Property: </w:t>
       </w:r>
-      <w:hyperlink r:id="rId33">
+      <w:hyperlink r:id="rId32">
         <w:r>
           <w:rPr>
-            <w:color w:val="174D47"/>
+            <w:color w:val="0066CC"/>
           </w:rPr>
           <w:t>MakeMyTrip Hotel Augusto</w:t>
         </w:r>
@@ -1054,10 +1051,10 @@
       <w:r>
         <w:t xml:space="preserve">. Destination: </w:t>
       </w:r>
-      <w:hyperlink r:id="rId34">
+      <w:hyperlink r:id="rId33">
         <w:r>
           <w:rPr>
-            <w:color w:val="174D47"/>
+            <w:color w:val="0066CC"/>
           </w:rPr>
           <w:t>Kashi Vishwanath</w:t>
         </w:r>
@@ -1065,10 +1062,10 @@
       <w:r>
         <w:t xml:space="preserve">, </w:t>
       </w:r>
-      <w:hyperlink r:id="rId35">
+      <w:hyperlink r:id="rId34">
         <w:r>
           <w:rPr>
-            <w:color w:val="174D47"/>
+            <w:color w:val="0066CC"/>
           </w:rPr>
           <w:t>Dashashwamedh Ghat</w:t>
         </w:r>
@@ -1076,12 +1073,23 @@
       <w:r>
         <w:t xml:space="preserve">. Credits: </w:t>
       </w:r>
+      <w:hyperlink r:id="rId35">
+        <w:r>
+          <w:rPr>
+            <w:color w:val="0066CC"/>
+          </w:rPr>
+          <w:t>Pradum Shukla temple photo</w:t>
+        </w:r>
+      </w:hyperlink>
+      <w:r>
+        <w:t xml:space="preserve">, </w:t>
+      </w:r>
       <w:hyperlink r:id="rId36">
         <w:r>
           <w:rPr>
-            <w:color w:val="174D47"/>
+            <w:color w:val="0066CC"/>
           </w:rPr>
-          <w:t>Pradum Shukla temple photo</w:t>
+          <w:t>CC BY 4.0</w:t>
         </w:r>
       </w:hyperlink>
       <w:r>
@@ -1090,18 +1098,7 @@
       <w:hyperlink r:id="rId37">
         <w:r>
           <w:rPr>
-            <w:color w:val="174D47"/>
-          </w:rPr>
-          <w:t>CC BY 4.0</w:t>
-        </w:r>
-      </w:hyperlink>
-      <w:r>
-        <w:t xml:space="preserve">, </w:t>
-      </w:r>
-      <w:hyperlink r:id="rId38">
-        <w:r>
-          <w:rPr>
-            <w:color w:val="174D47"/>
+            <w:color w:val="0066CC"/>
           </w:rPr>
           <w:t>Unsplash licence</w:t>
         </w:r>
@@ -1116,7 +1113,7 @@
       </w:pPr>
       <w:r>
         <w:rPr>
-          <w:color w:val="596762"/>
+          <w:color w:val="565B65"/>
           <w:sz w:val="16"/>
         </w:rPr>
         <w:t>Regenerate both handoff files with: python scripts/generate_handoff.py. The generator uses python-docx and verifies that its DOCX can be reopened.</w:t>
@@ -1160,7 +1157,7 @@
     </w:pPr>
     <w:r>
       <w:rPr>
-        <w:color w:val="596762"/>
+        <w:color w:val="565B65"/>
         <w:sz w:val="16"/>
       </w:rPr>
       <w:t>DIGIOCULAR  /  HOTEL AUGUSTO</w:t>
@@ -1537,7 +1534,7 @@
     </w:pPr>
     <w:rPr>
       <w:rFonts w:ascii="Arial" w:hAnsi="Arial"/>
-      <w:color w:val="162A27"/>
+      <w:color w:val="23252B"/>
       <w:sz w:val="21"/>
     </w:rPr>
   </w:style>
@@ -1603,7 +1600,7 @@
       <w:rFonts w:asciiTheme="majorHAnsi" w:eastAsiaTheme="majorEastAsia" w:hAnsiTheme="majorHAnsi" w:cstheme="majorBidi" w:ascii="Arial" w:hAnsi="Arial"/>
       <w:b/>
       <w:bCs/>
-      <w:color w:val="162A27"/>
+      <w:color w:val="23252B"/>
       <w:sz w:val="28"/>
       <w:szCs w:val="28"/>
     </w:rPr>
@@ -1891,7 +1888,7 @@
     <w:rPr>
       <w:rFonts w:asciiTheme="majorHAnsi" w:eastAsiaTheme="majorEastAsia" w:hAnsiTheme="majorHAnsi" w:cstheme="majorBidi" w:ascii="Arial" w:hAnsi="Arial"/>
       <w:b/>
-      <w:color w:val="162A27"/>
+      <w:color w:val="23252B"/>
       <w:spacing w:val="5"/>
       <w:kern w:val="28"/>
       <w:sz w:val="60"/>
@@ -1930,7 +1927,7 @@
       <w:rFonts w:asciiTheme="majorHAnsi" w:eastAsiaTheme="majorEastAsia" w:hAnsiTheme="majorHAnsi" w:cstheme="majorBidi" w:ascii="Arial" w:hAnsi="Arial"/>
       <w:i w:val="0"/>
       <w:iCs/>
-      <w:color w:val="162A27"/>
+      <w:color w:val="23252B"/>
       <w:spacing w:val="15"/>
       <w:sz w:val="26"/>
       <w:szCs w:val="24"/>
@@ -2072,7 +2069,7 @@
     </w:pPr>
     <w:rPr>
       <w:rFonts w:ascii="Arial" w:hAnsi="Arial"/>
-      <w:color w:val="162A27"/>
+      <w:color w:val="23252B"/>
     </w:rPr>
   </w:style>
   <w:style w:type="paragraph" w:styleId="ListBullet2">

</xml_diff>

<commit_message>
Build Augusto's full hospitality experience
</commit_message>
<xml_diff>
--- a/docs/HANDOFF.docx
+++ b/docs/HANDOFF.docx
@@ -26,10 +26,10 @@
       </w:pPr>
       <w:r>
         <w:rPr>
-          <w:color w:val="565B65"/>
+          <w:color w:val="69645C"/>
           <w:sz w:val="16"/>
         </w:rPr>
-        <w:t>Generated 20 October 2026, 05:25 UTC. Regenerate after final verification or deployment changes.</w:t>
+        <w:t>Generated 20 October 2026, 06:06 UTC. Regenerate after final verification or deployment changes.</w:t>
       </w:r>
     </w:p>
     <w:p>
@@ -72,6 +72,46 @@
         <w:widowControl/>
       </w:pPr>
       <w:r>
+        <w:t xml:space="preserve">An owner-private Sites preview is configured at </w:t>
+      </w:r>
+      <w:hyperlink r:id="rId11">
+        <w:r>
+          <w:rPr>
+            <w:color w:val="795938"/>
+          </w:rPr>
+          <w:t>hotel-augusto.candy-okapi-4696.chatgpt.site</w:t>
+        </w:r>
+      </w:hyperlink>
+      <w:r>
+        <w:t xml:space="preserve">. Current publication status is recorded in </w:t>
+      </w:r>
+      <w:hyperlink r:id="rId12">
+        <w:r>
+          <w:rPr>
+            <w:color w:val="795938"/>
+          </w:rPr>
+          <w:t>the deployment record</w:t>
+        </w:r>
+      </w:hyperlink>
+      <w:r>
+        <w:t xml:space="preserve">; the public hotel launch remains separate. </w:t>
+      </w:r>
+      <w:r>
+        <w:rPr>
+          <w:rFonts w:ascii="Consolas" w:hAnsi="Consolas"/>
+          <w:sz w:val="18"/>
+        </w:rPr>
+        <w:t>.openai/hosting.json</w:t>
+      </w:r>
+      <w:r>
+        <w:t xml:space="preserve"> records the existing Sites project.</w:t>
+      </w:r>
+    </w:p>
+    <w:p>
+      <w:pPr>
+        <w:widowControl/>
+      </w:pPr>
+      <w:r>
         <w:t xml:space="preserve">Git origin at generation: </w:t>
       </w:r>
       <w:r>
@@ -99,7 +139,7 @@
         <w:widowControl/>
       </w:pPr>
       <w:r>
-        <w:t>The 20 October correction restores the Apple-inspired foundation the user explicitly liked, now larger and more animated. Local Manrope display at weight 650 and Inter body, pearl surfaces, charcoal text and a restrained blue accent support large real photographs, generous spacing and rounded panels. Interior titles reach roughly 80–104px on desktop and 52–64px on mobile, with 18px desktop / 17px mobile body copy and readable labels. All 11 pages and the improved Varanasi hero remain.</w:t>
+        <w:t>The latest 20 October brief brings most Hotel Vagmi elements into Augusto's own hospitality identity. Local Bodoni Moda at weight 400 and Manrope body combine with ivory, ink blue and bronze. Genuine property photographs lead the hero, all three room categories are visible, and detailed dining, arrival and city content give the hotel substance across 16 pages. Asymmetric spreads, fine rules and modest 4–8px corners replace the earlier product-like Apple treatment.</w:t>
       </w:r>
     </w:p>
     <w:p>
@@ -107,29 +147,40 @@
         <w:widowControl/>
       </w:pPr>
       <w:r>
-        <w:t xml:space="preserve">Hotel and dining retain their distinct compositions. Photography and form panels use soft 24–32px corners; primary actions and enquiry controls are approximately 56px desktop / 50px mobile. Contact fields stay at 17px or larger on mobile. Visible entrance and scroll motion respect reduced-motion preferences and native scrolling. See </w:t>
+        <w:t xml:space="preserve">Interior titles reach roughly 76–104px on desktop and 48–58px on mobile; body copy is 18px desktop / 17px mobile. Rectangular actions are approximately 52–54px high. Hero scene controls, a pause action, photo transitions and reveals respect reduced motion and native scrolling. See the </w:t>
       </w:r>
-      <w:hyperlink r:id="rId11">
+      <w:hyperlink r:id="rId13">
         <w:r>
           <w:rPr>
-            <w:color w:val="0066CC"/>
+            <w:color w:val="795938"/>
           </w:rPr>
-          <w:t>current Apple premium contract</w:t>
+          <w:t>hospitality reference study</w:t>
+        </w:r>
+      </w:hyperlink>
+      <w:r>
+        <w:t xml:space="preserve">, </w:t>
+      </w:r>
+      <w:hyperlink r:id="rId14">
+        <w:r>
+          <w:rPr>
+            <w:color w:val="795938"/>
+          </w:rPr>
+          <w:t>feature and fact plan</w:t>
         </w:r>
       </w:hyperlink>
       <w:r>
         <w:t xml:space="preserve"> and </w:t>
       </w:r>
-      <w:hyperlink r:id="rId12">
+      <w:hyperlink r:id="rId15">
         <w:r>
           <w:rPr>
-            <w:color w:val="0066CC"/>
+            <w:color w:val="795938"/>
           </w:rPr>
           <w:t>implementation plan</w:t>
         </w:r>
       </w:hyperlink>
       <w:r>
-        <w:t>. The previous verdigris and smaller Apple revisions remain historical references.</w:t>
+        <w:t>. Earlier design documents remain historical.</w:t>
       </w:r>
     </w:p>
     <w:p>
@@ -155,7 +206,7 @@
         <w:t>/</w:t>
       </w:r>
       <w:r>
-        <w:t xml:space="preserve"> — hotel introduction, room selection, dining and Varanasi photography.</w:t>
+        <w:t xml:space="preserve"> — genuine-property hero, dated StayBar, welcome, all rooms, dining, city itinerary, an attributed guest excerpt and review links, gallery, arrival, FAQs, guides and a final enquiry.</w:t>
       </w:r>
     </w:p>
     <w:p>
@@ -199,16 +250,6 @@
         <w:t>/rooms</w:t>
       </w:r>
       <w:r>
-        <w:t xml:space="preserve"> and </w:t>
-      </w:r>
-      <w:r>
-        <w:rPr>
-          <w:rFonts w:ascii="Consolas" w:hAnsi="Consolas"/>
-          <w:sz w:val="18"/>
-        </w:rPr>
-        <w:t>/rooms/deluxe-room</w:t>
-      </w:r>
-      <w:r>
         <w:t xml:space="preserve">, </w:t>
       </w:r>
       <w:r>
@@ -216,20 +257,10 @@
           <w:rFonts w:ascii="Consolas" w:hAnsi="Consolas"/>
           <w:sz w:val="18"/>
         </w:rPr>
-        <w:t>/rooms/deluxe-twin-room</w:t>
+        <w:t>/rooms/compare</w:t>
       </w:r>
       <w:r>
-        <w:t xml:space="preserve">, </w:t>
-      </w:r>
-      <w:r>
-        <w:rPr>
-          <w:rFonts w:ascii="Consolas" w:hAnsi="Consolas"/>
-          <w:sz w:val="18"/>
-        </w:rPr>
-        <w:t>/rooms/family-room</w:t>
-      </w:r>
-      <w:r>
-        <w:t xml:space="preserve"> — comparison and individual room pages.</w:t>
+        <w:t xml:space="preserve"> and three room-detail pages — visible categories, factual bed layouts, a mobile two-room selector, photo walkthroughs and room-prefilled enquiries.</w:t>
       </w:r>
     </w:p>
     <w:p>
@@ -270,6 +301,53 @@
           <w:rFonts w:ascii="Consolas" w:hAnsi="Consolas"/>
           <w:sz w:val="18"/>
         </w:rPr>
+        <w:t>/guides</w:t>
+      </w:r>
+      <w:r>
+        <w:t xml:space="preserve"> and </w:t>
+      </w:r>
+      <w:r>
+        <w:rPr>
+          <w:rFonts w:ascii="Consolas" w:hAnsi="Consolas"/>
+          <w:sz w:val="18"/>
+        </w:rPr>
+        <w:t>/guides/first-visit-to-kashi</w:t>
+      </w:r>
+      <w:r>
+        <w:t xml:space="preserve">, </w:t>
+      </w:r>
+      <w:r>
+        <w:rPr>
+          <w:rFonts w:ascii="Consolas" w:hAnsi="Consolas"/>
+          <w:sz w:val="18"/>
+        </w:rPr>
+        <w:t>/guides/arriving-in-godowlia</w:t>
+      </w:r>
+      <w:r>
+        <w:t xml:space="preserve">, </w:t>
+      </w:r>
+      <w:r>
+        <w:rPr>
+          <w:rFonts w:ascii="Consolas" w:hAnsi="Consolas"/>
+          <w:sz w:val="18"/>
+        </w:rPr>
+        <w:t>/guides/choosing-your-room</w:t>
+      </w:r>
+      <w:r>
+        <w:t xml:space="preserve"> — practical planning articles.</w:t>
+      </w:r>
+    </w:p>
+    <w:p>
+      <w:pPr>
+        <w:pStyle w:val="ListBullet"/>
+        <w:widowControl/>
+      </w:pPr>
+      <w:r/>
+      <w:r>
+        <w:rPr>
+          <w:rFonts w:ascii="Consolas" w:hAnsi="Consolas"/>
+          <w:sz w:val="18"/>
+        </w:rPr>
         <w:t>/contact</w:t>
       </w:r>
       <w:r>
@@ -291,7 +369,7 @@
         <w:widowControl/>
       </w:pPr>
       <w:r>
-        <w:t xml:space="preserve">Edit facts and the contact number in </w:t>
+        <w:t xml:space="preserve">Core facts and contact: </w:t>
       </w:r>
       <w:r>
         <w:rPr>
@@ -301,7 +379,27 @@
         <w:t>content/hotel.ts</w:t>
       </w:r>
       <w:r>
-        <w:t xml:space="preserve">; room photographs in </w:t>
+        <w:t xml:space="preserve">. Facilities, review links and arrival: </w:t>
+      </w:r>
+      <w:r>
+        <w:rPr>
+          <w:rFonts w:ascii="Consolas" w:hAnsi="Consolas"/>
+          <w:sz w:val="18"/>
+        </w:rPr>
+        <w:t>content/hospitality.ts</w:t>
+      </w:r>
+      <w:r>
+        <w:t xml:space="preserve">. Guides: </w:t>
+      </w:r>
+      <w:r>
+        <w:rPr>
+          <w:rFonts w:ascii="Consolas" w:hAnsi="Consolas"/>
+          <w:sz w:val="18"/>
+        </w:rPr>
+        <w:t>content/guides.ts</w:t>
+      </w:r>
+      <w:r>
+        <w:t xml:space="preserve">. Photos: </w:t>
       </w:r>
       <w:r>
         <w:rPr>
@@ -311,7 +409,7 @@
         <w:t>content/room-images.ts</w:t>
       </w:r>
       <w:r>
-        <w:t xml:space="preserve">; visual tokens in </w:t>
+        <w:t xml:space="preserve">. Tokens: </w:t>
       </w:r>
       <w:r>
         <w:rPr>
@@ -321,7 +419,7 @@
         <w:t>app/globals.css</w:t>
       </w:r>
       <w:r>
-        <w:t xml:space="preserve">. Booking validation and WhatsApp URL generation live in </w:t>
+        <w:t xml:space="preserve">. Booking validation and WhatsApp URLs: </w:t>
       </w:r>
       <w:r>
         <w:rPr>
@@ -331,17 +429,37 @@
         <w:t>lib/booking.ts</w:t>
       </w:r>
       <w:r>
-        <w:t xml:space="preserve">, with the form in </w:t>
+        <w:t xml:space="preserve">; page-to-page travel preferences: </w:t>
       </w:r>
       <w:r>
         <w:rPr>
           <w:rFonts w:ascii="Consolas" w:hAnsi="Consolas"/>
           <w:sz w:val="18"/>
         </w:rPr>
-        <w:t>components/booking-form.tsx</w:t>
+        <w:t>lib/stay-query.ts</w:t>
       </w:r>
       <w:r>
-        <w:t>. Replace that handoff deliberately when integrating an approved booking engine.</w:t>
+        <w:t xml:space="preserve">. The reusable </w:t>
+      </w:r>
+      <w:r>
+        <w:rPr>
+          <w:rFonts w:ascii="Consolas" w:hAnsi="Consolas"/>
+          <w:sz w:val="18"/>
+        </w:rPr>
+        <w:t>StayBar</w:t>
+      </w:r>
+      <w:r>
+        <w:t xml:space="preserve"> and </w:t>
+      </w:r>
+      <w:r>
+        <w:rPr>
+          <w:rFonts w:ascii="Consolas" w:hAnsi="Consolas"/>
+          <w:sz w:val="18"/>
+        </w:rPr>
+        <w:t>ArrivalGuide</w:t>
+      </w:r>
+      <w:r>
+        <w:t xml:space="preserve"> components serve multiple pages. Adapt the enquiry handoff deliberately when adding an approved booking engine.</w:t>
       </w:r>
     </w:p>
     <w:p>
@@ -435,45 +553,12 @@
       <w:r>
         <w:t xml:space="preserve">Evidence: </w:t>
       </w:r>
-      <w:hyperlink r:id="rId13">
-        <w:r>
-          <w:rPr>
-            <w:color w:val="0066CC"/>
-          </w:rPr>
-          <w:t>fact sheet</w:t>
-        </w:r>
-      </w:hyperlink>
-      <w:r>
-        <w:t xml:space="preserve">, </w:t>
-      </w:r>
-      <w:hyperlink r:id="rId14">
-        <w:r>
-          <w:rPr>
-            <w:color w:val="0066CC"/>
-          </w:rPr>
-          <w:t>source ledger</w:t>
-        </w:r>
-      </w:hyperlink>
-      <w:r>
-        <w:t xml:space="preserve">, </w:t>
-      </w:r>
-      <w:hyperlink r:id="rId15">
-        <w:r>
-          <w:rPr>
-            <w:color w:val="0066CC"/>
-          </w:rPr>
-          <w:t>asset manifest</w:t>
-        </w:r>
-      </w:hyperlink>
-      <w:r>
-        <w:t xml:space="preserve">, </w:t>
-      </w:r>
       <w:hyperlink r:id="rId16">
         <w:r>
           <w:rPr>
-            <w:color w:val="0066CC"/>
+            <w:color w:val="795938"/>
           </w:rPr>
-          <w:t>Maps verification</w:t>
+          <w:t>fact sheet</w:t>
         </w:r>
       </w:hyperlink>
       <w:r>
@@ -482,7 +567,40 @@
       <w:hyperlink r:id="rId17">
         <w:r>
           <w:rPr>
-            <w:color w:val="0066CC"/>
+            <w:color w:val="795938"/>
+          </w:rPr>
+          <w:t>source ledger</w:t>
+        </w:r>
+      </w:hyperlink>
+      <w:r>
+        <w:t xml:space="preserve">, </w:t>
+      </w:r>
+      <w:hyperlink r:id="rId18">
+        <w:r>
+          <w:rPr>
+            <w:color w:val="795938"/>
+          </w:rPr>
+          <w:t>asset manifest</w:t>
+        </w:r>
+      </w:hyperlink>
+      <w:r>
+        <w:t xml:space="preserve">, </w:t>
+      </w:r>
+      <w:hyperlink r:id="rId19">
+        <w:r>
+          <w:rPr>
+            <w:color w:val="795938"/>
+          </w:rPr>
+          <w:t>Maps verification</w:t>
+        </w:r>
+      </w:hyperlink>
+      <w:r>
+        <w:t xml:space="preserve">, </w:t>
+      </w:r>
+      <w:hyperlink r:id="rId20">
+        <w:r>
+          <w:rPr>
+            <w:color w:val="795938"/>
           </w:rPr>
           <w:t>WhatsApp verification</w:t>
         </w:r>
@@ -496,36 +614,58 @@
         <w:widowControl/>
       </w:pPr>
       <w:r>
-        <w:t xml:space="preserve">The user-supplied MakeMyTrip dated route was tried in a fresh browser and returned an HTTP/2 transport error. The canonical indexed MMT property page corroborates the address, room categories and vegetarian dining; it does not verify live dated availability. Google’s rendered profile and eight accessible still-photo entries were inspected, and three additional real property photographs were collected. See </w:t>
+        <w:t xml:space="preserve">The user-supplied dated MakeMyTrip route returned a browser HTTP/2 transport error. Its indexed canonical page corroborates stable property facts; a fresh 20 October amenities index supports the expanded service details, not live dated availability. Google's rendered profile and accessible property photos were inspected. See </w:t>
       </w:r>
-      <w:hyperlink r:id="rId18">
+      <w:hyperlink r:id="rId21">
         <w:r>
           <w:rPr>
-            <w:color w:val="0066CC"/>
+            <w:color w:val="795938"/>
           </w:rPr>
-          <w:t>OTA revision record</w:t>
+          <w:t>OTA source record</w:t>
         </w:r>
       </w:hyperlink>
       <w:r>
         <w:t xml:space="preserve">, </w:t>
       </w:r>
-      <w:hyperlink r:id="rId19">
+      <w:hyperlink r:id="rId22">
         <w:r>
           <w:rPr>
-            <w:color w:val="0066CC"/>
+            <w:color w:val="795938"/>
           </w:rPr>
-          <w:t>source-to-page mapping</w:t>
+          <w:t>photo mapping</w:t>
+        </w:r>
+      </w:hyperlink>
+      <w:r>
+        <w:t xml:space="preserve">, </w:t>
+      </w:r>
+      <w:hyperlink r:id="rId14">
+        <w:r>
+          <w:rPr>
+            <w:color w:val="795938"/>
+          </w:rPr>
+          <w:t>new feature evidence</w:t>
+        </w:r>
+      </w:hyperlink>
+      <w:r>
+        <w:t xml:space="preserve">, </w:t>
+      </w:r>
+      <w:hyperlink r:id="rId23">
+        <w:r>
+          <w:rPr>
+            <w:color w:val="795938"/>
+          </w:rPr>
+          <w:t>guest-excerpt evidence</w:t>
         </w:r>
       </w:hyperlink>
       <w:r>
         <w:t xml:space="preserve"> and </w:t>
       </w:r>
-      <w:hyperlink r:id="rId20">
+      <w:hyperlink r:id="rId24">
         <w:r>
           <w:rPr>
-            <w:color w:val="0066CC"/>
+            <w:color w:val="795938"/>
           </w:rPr>
-          <w:t>new asset ledger</w:t>
+          <w:t>official visitor-link checks</w:t>
         </w:r>
       </w:hyperlink>
       <w:r>
@@ -660,7 +800,7 @@
           <w:rFonts w:ascii="Consolas" w:hAnsi="Consolas"/>
           <w:sz w:val="18"/>
         </w:rPr>
-        <w:t>python scripts/browser_qa.py --base-url http://127.0.0.1:3080</w:t>
+        <w:t>python scripts/qa_hospitality_revision.py --base-url http://127.0.0.1:3080</w:t>
       </w:r>
     </w:p>
     <w:p>
@@ -747,6 +887,45 @@
         <w:widowControl/>
       </w:pPr>
       <w:r>
+        <w:t xml:space="preserve">Normal Next.js/Vercel operation is the default. For the private static preview only, set </w:t>
+      </w:r>
+      <w:r>
+        <w:rPr>
+          <w:rFonts w:ascii="Consolas" w:hAnsi="Consolas"/>
+          <w:sz w:val="18"/>
+        </w:rPr>
+        <w:t>SITE_STATIC_EXPORT=true</w:t>
+      </w:r>
+      <w:r>
+        <w:t xml:space="preserve"> before </w:t>
+      </w:r>
+      <w:r>
+        <w:rPr>
+          <w:rFonts w:ascii="Consolas" w:hAnsi="Consolas"/>
+          <w:sz w:val="18"/>
+        </w:rPr>
+        <w:t>npm run build</w:t>
+      </w:r>
+      <w:r>
+        <w:t xml:space="preserve">; the result is </w:t>
+      </w:r>
+      <w:r>
+        <w:rPr>
+          <w:rFonts w:ascii="Consolas" w:hAnsi="Consolas"/>
+          <w:sz w:val="18"/>
+        </w:rPr>
+        <w:t>out/</w:t>
+      </w:r>
+      <w:r>
+        <w:t>. Unset the flag for the next normal build. Static export disables server image optimization; the static host must supply response headers. Keep previews noindex and verify their deployed behavior.</w:t>
+      </w:r>
+    </w:p>
+    <w:p>
+      <w:pPr>
+        <w:pStyle w:val="ListBullet"/>
+        <w:widowControl/>
+      </w:pPr>
+      <w:r>
         <w:t>Do not infer ownership from old hotel domains: research found a failed domain and an affiliate redirect. Obtain the client's intended domain and access separately.</w:t>
       </w:r>
     </w:p>
@@ -767,16 +946,16 @@
       <w:r>
         <w:t xml:space="preserve">Latest completed shared report: </w:t>
       </w:r>
-      <w:hyperlink r:id="rId21">
+      <w:hyperlink r:id="rId25">
         <w:r>
           <w:rPr>
-            <w:color w:val="0066CC"/>
+            <w:color w:val="795938"/>
           </w:rPr>
-          <w:t>evidence/qa-apple-premium-production.json</w:t>
+          <w:t>evidence/hospitality-revision/production-qa.json</w:t>
         </w:r>
       </w:hyperlink>
       <w:r>
-        <w:t xml:space="preserve">, completed 2026-10-20T05:23:43.863633+00:00 against </w:t>
+        <w:t xml:space="preserve">, completed 2026-10-20T05:58:42.349172+00:00 against </w:t>
       </w:r>
       <w:r>
         <w:rPr>
@@ -786,7 +965,7 @@
         <w:t>http://127.0.0.1:3080</w:t>
       </w:r>
       <w:r>
-        <w:t>. Status: PASS. It records 72 viewport checks, 24 axe audits, 76 interaction checks and 0 failures. These are report counts, not a claim that an unrecorded final run passed.</w:t>
+        <w:t>. Status: PASS. It records 102 viewport checks, 34 axe audits, 40 interaction checks and 0 failures. These are report counts, not a claim that an unrecorded final run passed.</w:t>
       </w:r>
     </w:p>
     <w:p>
@@ -794,7 +973,7 @@
         <w:widowControl/>
       </w:pPr>
       <w:r>
-        <w:t>The initial report recorded 1 failed automated check. The final report includes 3 targeted keyboard-link retests using a 1px outer-edge rounding tolerance and fully visible text bounds. The original run, retest evidence and timestamps remain preserved in that report; no application change was required between those runs.</w:t>
+        <w:t>The refreshed production audit is dated 2026-10-20T06:00:16.943938+00:00; its OG image is 1200 × 630px. Throttled mobile samples: LCP 1780ms / CLS 0.0000; LCP 1728ms / CLS 0.0000. These are local synthetic measurements, not field Core Web Vitals or a Lighthouse score. The audit retains response headers and runtime observations.</w:t>
       </w:r>
     </w:p>
     <w:p>
@@ -802,12 +981,12 @@
         <w:widowControl/>
       </w:pPr>
       <w:r>
-        <w:t xml:space="preserve">Focused hotel, dining, contact and privacy review: 8 route/viewport records at 390, 1440px; layout/image/runtime checks pass. The rendered screenshots were inspected for type scale, image framing and control alignment. Evidence: </w:t>
+        <w:t xml:space="preserve">Focused hotel/dining review: 4 route/viewport records at 390, 1440px and 16 interactions; checks pass. Screenshots and the activated Hotel Augusto map pin were visually inspected. This focused dev check supplements the production report. Evidence: </w:t>
       </w:r>
-      <w:hyperlink r:id="rId22">
+      <w:hyperlink r:id="rId26">
         <w:r>
           <w:rPr>
-            <w:color w:val="0066CC"/>
+            <w:color w:val="795938"/>
           </w:rPr>
           <w:t>page review</w:t>
         </w:r>
@@ -828,30 +1007,20 @@
           <w:rFonts w:ascii="Consolas" w:hAnsi="Consolas"/>
           <w:sz w:val="18"/>
         </w:rPr>
-        <w:t>evidence/apple-premium/</w:t>
+        <w:t>evidence/hospitality-revision/</w:t>
       </w:r>
       <w:r>
-        <w:t xml:space="preserve">; the intended final report is </w:t>
+        <w:t xml:space="preserve">; the final report is </w:t>
       </w:r>
       <w:r>
         <w:rPr>
           <w:rFonts w:ascii="Consolas" w:hAnsi="Consolas"/>
           <w:sz w:val="18"/>
         </w:rPr>
-        <w:t>evidence/qa-apple-premium-production.json</w:t>
+        <w:t>evidence/hospitality-revision/production-qa.json</w:t>
       </w:r>
       <w:r>
-        <w:t xml:space="preserve">. Earlier Apple/cinematic reports and </w:t>
-      </w:r>
-      <w:r>
-        <w:rPr>
-          <w:rFonts w:ascii="Consolas" w:hAnsi="Consolas"/>
-          <w:sz w:val="18"/>
-        </w:rPr>
-        <w:t>research/awwwards-revision/</w:t>
-      </w:r>
-      <w:r>
-        <w:t xml:space="preserve"> remain reference history. Use the latest completed report and its remaining failures; earlier passes do not certify later edits. Browser checks do not establish hotel policy accuracy or photo rights.</w:t>
+        <w:t>. Earlier Apple/cinematic reports remain history. Browser checks do not establish hotel policy accuracy, live availability or photo rights.</w:t>
       </w:r>
     </w:p>
     <w:p>
@@ -861,10 +1030,10 @@
       <w:r>
         <w:t xml:space="preserve">Release evidence: </w:t>
       </w:r>
-      <w:hyperlink r:id="rId23">
+      <w:hyperlink r:id="rId27">
         <w:r>
           <w:rPr>
-            <w:color w:val="0066CC"/>
+            <w:color w:val="795938"/>
           </w:rPr>
           <w:t>production audit</w:t>
         </w:r>
@@ -872,10 +1041,10 @@
       <w:r>
         <w:t xml:space="preserve">, </w:t>
       </w:r>
-      <w:hyperlink r:id="rId24">
+      <w:hyperlink r:id="rId28">
         <w:r>
           <w:rPr>
-            <w:color w:val="0066CC"/>
+            <w:color w:val="795938"/>
           </w:rPr>
           <w:t>scoped storage cleanup</w:t>
         </w:r>
@@ -883,16 +1052,16 @@
       <w:r>
         <w:t xml:space="preserve">, and </w:t>
       </w:r>
-      <w:hyperlink r:id="rId25">
+      <w:hyperlink r:id="rId29">
         <w:r>
           <w:rPr>
-            <w:color w:val="0066CC"/>
+            <w:color w:val="795938"/>
           </w:rPr>
           <w:t>inactive development output cleanup</w:t>
         </w:r>
       </w:hyperlink>
       <w:r>
-        <w:t>. The development cleanup records 240,653,234 bytes removed after stopping the dev session; production was verified afterwards. The local preview remains noindex. An approved public domain and route canonical configuration still require launch verification.</w:t>
+        <w:t>. The development cleanup records 290,643,233 bytes removed after stopping the dev session; production was verified afterwards. The local preview remains noindex. An approved public domain and route canonical configuration still require launch verification.</w:t>
       </w:r>
     </w:p>
     <w:p>
@@ -935,6 +1104,14 @@
     </w:p>
     <w:p>
       <w:pPr>
+        <w:widowControl/>
+      </w:pPr>
+      <w:r>
+        <w:t>A separate 29,539-byte generated handoff bytecode file was also rejected for cleanup by automatic approval review. It remains retained; no retry is part of this revision. Current scoped cleanup records preserve all source, licensed assets and review evidence.</w:t>
+      </w:r>
+    </w:p>
+    <w:p>
+      <w:pPr>
         <w:pStyle w:val="Heading1"/>
         <w:widowControl/>
       </w:pPr>
@@ -949,10 +1126,10 @@
       <w:r>
         <w:t xml:space="preserve">The recorded production dependency audit has 0 vulnerabilities. The full audit records 5 high findings from one development-only ESLint chain ending in braces 3.0.3. </w:t>
       </w:r>
-      <w:hyperlink r:id="rId26">
+      <w:hyperlink r:id="rId30">
         <w:r>
           <w:rPr>
-            <w:color w:val="0066CC"/>
+            <w:color w:val="795938"/>
           </w:rPr>
           <w:t>GHSA-vfj7-8cjw-p6xm</w:t>
         </w:r>
@@ -960,10 +1137,10 @@
       <w:r>
         <w:t xml:space="preserve"> had no official patched release at the 19 October 2026 review. Keep the lockfile, recheck upstream and do not force-downgrade Next.js to silence it. Details: </w:t>
       </w:r>
-      <w:hyperlink r:id="rId27">
+      <w:hyperlink r:id="rId31">
         <w:r>
           <w:rPr>
-            <w:color w:val="0066CC"/>
+            <w:color w:val="795938"/>
           </w:rPr>
           <w:t>security review</w:t>
         </w:r>
@@ -977,7 +1154,7 @@
         <w:widowControl/>
       </w:pPr>
       <w:r>
-        <w:t>The enquiry stays in browser memory until the visitor opens the encoded WhatsApp link. No silent message sending, payment collection, analytics or enquiry persistence is installed. Security headers, Hotel JSON-LD, local fonts and a 1200×630 OG image are included. Revisit privacy and security when a booking engine or analytics is added.</w:t>
+        <w:t>StayBar passes validated dates, party size and room preference through the contact URL; these may remain in browser history. Names and personal notes stay off that URL. The form prepares a WhatsApp draft without saving enquiries or sending silently. The Google map iframe loads only on explicit activation. No payment collection or analytics is installed. Security headers, Hotel JSON-LD, local fonts and a 1200×630 OG image are included. Privacy must be revisited when these features change.</w:t>
       </w:r>
     </w:p>
     <w:p>
@@ -996,54 +1173,42 @@
       <w:r>
         <w:t xml:space="preserve">Design: </w:t>
       </w:r>
-      <w:hyperlink r:id="rId28">
+      <w:hyperlink r:id="rId32">
         <w:r>
           <w:rPr>
-            <w:color w:val="0066CC"/>
+            <w:color w:val="795938"/>
+          </w:rPr>
+          <w:t>Hotel Vagmi</w:t>
+        </w:r>
+      </w:hyperlink>
+      <w:r>
+        <w:t xml:space="preserve">, </w:t>
+      </w:r>
+      <w:hyperlink r:id="rId33">
+        <w:r>
+          <w:rPr>
+            <w:color w:val="795938"/>
           </w:rPr>
           <w:t>The Drake on Awwwards</w:t>
         </w:r>
       </w:hyperlink>
       <w:r>
-        <w:t xml:space="preserve">, </w:t>
+        <w:t xml:space="preserve">, plus Shree Ganesha Palace and live reference captures in </w:t>
       </w:r>
-      <w:hyperlink r:id="rId29">
-        <w:r>
-          <w:rPr>
-            <w:color w:val="0066CC"/>
-          </w:rPr>
-          <w:t>Kaskady on Awwwards</w:t>
-        </w:r>
-      </w:hyperlink>
       <w:r>
-        <w:t xml:space="preserve">, </w:t>
+        <w:rPr>
+          <w:rFonts w:ascii="Consolas" w:hAnsi="Consolas"/>
+          <w:sz w:val="18"/>
+        </w:rPr>
+        <w:t>research/hospitality-revision/</w:t>
       </w:r>
-      <w:hyperlink r:id="rId30">
-        <w:r>
-          <w:rPr>
-            <w:color w:val="0066CC"/>
-          </w:rPr>
-          <w:t>Casa Cook on Awwwards</w:t>
-        </w:r>
-      </w:hyperlink>
-      <w:r>
-        <w:t xml:space="preserve">, </w:t>
-      </w:r>
-      <w:hyperlink r:id="rId31">
-        <w:r>
-          <w:rPr>
-            <w:color w:val="0066CC"/>
-          </w:rPr>
-          <w:t>Apple typography</w:t>
-        </w:r>
-      </w:hyperlink>
       <w:r>
         <w:t xml:space="preserve">. Property: </w:t>
       </w:r>
-      <w:hyperlink r:id="rId32">
+      <w:hyperlink r:id="rId34">
         <w:r>
           <w:rPr>
-            <w:color w:val="0066CC"/>
+            <w:color w:val="795938"/>
           </w:rPr>
           <w:t>MakeMyTrip Hotel Augusto</w:t>
         </w:r>
@@ -1051,34 +1216,12 @@
       <w:r>
         <w:t xml:space="preserve">. Destination: </w:t>
       </w:r>
-      <w:hyperlink r:id="rId33">
-        <w:r>
-          <w:rPr>
-            <w:color w:val="0066CC"/>
-          </w:rPr>
-          <w:t>Kashi Vishwanath</w:t>
-        </w:r>
-      </w:hyperlink>
-      <w:r>
-        <w:t xml:space="preserve">, </w:t>
-      </w:r>
-      <w:hyperlink r:id="rId34">
-        <w:r>
-          <w:rPr>
-            <w:color w:val="0066CC"/>
-          </w:rPr>
-          <w:t>Dashashwamedh Ghat</w:t>
-        </w:r>
-      </w:hyperlink>
-      <w:r>
-        <w:t xml:space="preserve">. Credits: </w:t>
-      </w:r>
       <w:hyperlink r:id="rId35">
         <w:r>
           <w:rPr>
-            <w:color w:val="0066CC"/>
+            <w:color w:val="795938"/>
           </w:rPr>
-          <w:t>Pradum Shukla temple photo</w:t>
+          <w:t>official temple visitor portal</w:t>
         </w:r>
       </w:hyperlink>
       <w:r>
@@ -1087,9 +1230,9 @@
       <w:hyperlink r:id="rId36">
         <w:r>
           <w:rPr>
-            <w:color w:val="0066CC"/>
+            <w:color w:val="795938"/>
           </w:rPr>
-          <w:t>CC BY 4.0</w:t>
+          <w:t>Kashi Vishwanath government page</w:t>
         </w:r>
       </w:hyperlink>
       <w:r>
@@ -1098,7 +1241,40 @@
       <w:hyperlink r:id="rId37">
         <w:r>
           <w:rPr>
-            <w:color w:val="0066CC"/>
+            <w:color w:val="795938"/>
+          </w:rPr>
+          <w:t>Dashashwamedh Ghat</w:t>
+        </w:r>
+      </w:hyperlink>
+      <w:r>
+        <w:t xml:space="preserve">. Credits: </w:t>
+      </w:r>
+      <w:hyperlink r:id="rId38">
+        <w:r>
+          <w:rPr>
+            <w:color w:val="795938"/>
+          </w:rPr>
+          <w:t>Pradum Shukla temple photo</w:t>
+        </w:r>
+      </w:hyperlink>
+      <w:r>
+        <w:t xml:space="preserve">, </w:t>
+      </w:r>
+      <w:hyperlink r:id="rId39">
+        <w:r>
+          <w:rPr>
+            <w:color w:val="795938"/>
+          </w:rPr>
+          <w:t>CC BY 4.0</w:t>
+        </w:r>
+      </w:hyperlink>
+      <w:r>
+        <w:t xml:space="preserve">, </w:t>
+      </w:r>
+      <w:hyperlink r:id="rId40">
+        <w:r>
+          <w:rPr>
+            <w:color w:val="795938"/>
           </w:rPr>
           <w:t>Unsplash licence</w:t>
         </w:r>
@@ -1113,7 +1289,7 @@
       </w:pPr>
       <w:r>
         <w:rPr>
-          <w:color w:val="565B65"/>
+          <w:color w:val="69645C"/>
           <w:sz w:val="16"/>
         </w:rPr>
         <w:t>Regenerate both handoff files with: python scripts/generate_handoff.py. The generator uses python-docx and verifies that its DOCX can be reopened.</w:t>
@@ -1157,7 +1333,7 @@
     </w:pPr>
     <w:r>
       <w:rPr>
-        <w:color w:val="565B65"/>
+        <w:color w:val="69645C"/>
         <w:sz w:val="16"/>
       </w:rPr>
       <w:t>DIGIOCULAR  /  HOTEL AUGUSTO</w:t>
@@ -1530,11 +1706,11 @@
     <w:qFormat/>
     <w:rsid w:val="00FC693F"/>
     <w:pPr>
-      <w:spacing w:line="276" w:lineRule="auto" w:after="140"/>
+      <w:spacing w:line="259" w:lineRule="auto" w:after="100"/>
     </w:pPr>
     <w:rPr>
       <w:rFonts w:ascii="Arial" w:hAnsi="Arial"/>
-      <w:color w:val="23252B"/>
+      <w:color w:val="25313D"/>
       <w:sz w:val="21"/>
     </w:rPr>
   </w:style>
@@ -1593,14 +1769,14 @@
     <w:pPr>
       <w:keepNext/>
       <w:keepLines/>
-      <w:spacing w:before="300" w:after="140"/>
+      <w:spacing w:before="240" w:after="120"/>
       <w:outlineLvl w:val="0"/>
     </w:pPr>
     <w:rPr>
       <w:rFonts w:asciiTheme="majorHAnsi" w:eastAsiaTheme="majorEastAsia" w:hAnsiTheme="majorHAnsi" w:cstheme="majorBidi" w:ascii="Arial" w:hAnsi="Arial"/>
       <w:b/>
       <w:bCs/>
-      <w:color w:val="23252B"/>
+      <w:color w:val="25313D"/>
       <w:sz w:val="28"/>
       <w:szCs w:val="28"/>
     </w:rPr>
@@ -1888,7 +2064,7 @@
     <w:rPr>
       <w:rFonts w:asciiTheme="majorHAnsi" w:eastAsiaTheme="majorEastAsia" w:hAnsiTheme="majorHAnsi" w:cstheme="majorBidi" w:ascii="Arial" w:hAnsi="Arial"/>
       <w:b/>
-      <w:color w:val="23252B"/>
+      <w:color w:val="25313D"/>
       <w:spacing w:val="5"/>
       <w:kern w:val="28"/>
       <w:sz w:val="60"/>
@@ -1927,7 +2103,7 @@
       <w:rFonts w:asciiTheme="majorHAnsi" w:eastAsiaTheme="majorEastAsia" w:hAnsiTheme="majorHAnsi" w:cstheme="majorBidi" w:ascii="Arial" w:hAnsi="Arial"/>
       <w:i w:val="0"/>
       <w:iCs/>
-      <w:color w:val="23252B"/>
+      <w:color w:val="25313D"/>
       <w:spacing w:val="15"/>
       <w:sz w:val="26"/>
       <w:szCs w:val="24"/>
@@ -2069,7 +2245,7 @@
     </w:pPr>
     <w:rPr>
       <w:rFonts w:ascii="Arial" w:hAnsi="Arial"/>
-      <w:color w:val="23252B"/>
+      <w:color w:val="25313D"/>
     </w:rPr>
   </w:style>
   <w:style w:type="paragraph" w:styleId="ListBullet2">

</xml_diff>

<commit_message>
Refine Augusto with immersive design and persistent stay enquiries
</commit_message>
<xml_diff>
--- a/docs/HANDOFF.docx
+++ b/docs/HANDOFF.docx
@@ -26,10 +26,10 @@
       </w:pPr>
       <w:r>
         <w:rPr>
-          <w:color w:val="69645C"/>
+          <w:color w:val="62656B"/>
           <w:sz w:val="16"/>
         </w:rPr>
-        <w:t>Generated 20 October 2026, 06:06 UTC. Regenerate after final verification or deployment changes.</w:t>
+        <w:t>Generated 20 October 2026, 07:32 UTC. Regenerate after final verification or deployment changes.</w:t>
       </w:r>
     </w:p>
     <w:p>
@@ -77,18 +77,18 @@
       <w:hyperlink r:id="rId11">
         <w:r>
           <w:rPr>
-            <w:color w:val="795938"/>
+            <w:color w:val="0066CC"/>
           </w:rPr>
           <w:t>hotel-augusto.candy-okapi-4696.chatgpt.site</w:t>
         </w:r>
       </w:hyperlink>
       <w:r>
-        <w:t xml:space="preserve">. Current publication status is recorded in </w:t>
+        <w:t xml:space="preserve">. This revision's publication status is recorded in </w:t>
       </w:r>
       <w:hyperlink r:id="rId12">
         <w:r>
           <w:rPr>
-            <w:color w:val="795938"/>
+            <w:color w:val="0066CC"/>
           </w:rPr>
           <w:t>the deployment record</w:t>
         </w:r>
@@ -139,7 +139,7 @@
         <w:widowControl/>
       </w:pPr>
       <w:r>
-        <w:t>The latest 20 October brief brings most Hotel Vagmi elements into Augusto's own hospitality identity. Local Bodoni Moda at weight 400 and Manrope body combine with ivory, ink blue and bronze. Genuine property photographs lead the hero, all three room categories are visible, and detailed dining, arrival and city content give the hotel substance across 16 pages. Asymmetric spreads, fine rules and modest 4–8px corners replace the earlier product-like Apple treatment.</w:t>
+        <w:t>The latest reference hierarchy puts Lando Norris first for bold composition and memorable motion, with Apple and Linear informing control clarity and precision. The shared system uses local Inter, near-white/cool-gray surfaces, charcoal and cobalt actions. Genuine Augusto photography and the supplied hotel logo anchor the 17-route hospitality experience.</w:t>
       </w:r>
     </w:p>
     <w:p>
@@ -147,40 +147,48 @@
         <w:widowControl/>
       </w:pPr>
       <w:r>
-        <w:t xml:space="preserve">Interior titles reach roughly 76–104px on desktop and 48–58px on mobile; body copy is 18px desktop / 17px mobile. Rectangular actions are approximately 52–54px high. Hero scene controls, a pause action, photo transitions and reveals respect reduced motion and native scrolling. See the </w:t>
+        <w:t>The homepage opens with nearly full-viewport property photography, the large left-aligned 'Your place / in Kashi.' headline and scene/pause controls within the photograph. Scene changes wait for image readiness. Spring pointer drift, native scroll scaling and independent hover/focus pause support the interaction. An ink-blue city chapter uses oversized decorative KASHI lettering, genuine river imagery and manual tabs.</w:t>
+      </w:r>
+    </w:p>
+    <w:p>
+      <w:pPr>
+        <w:widowControl/>
+      </w:pPr>
+      <w:r>
+        <w:t xml:space="preserve">Keep substantial headings, readable 18px/17px body copy, clear primary actions and at least 44px interactive targets. Hero motion, room-photo hover/focus feedback, menu transitions and reveals respect reduced motion and native scrolling. The </w:t>
       </w:r>
       <w:hyperlink r:id="rId13">
         <w:r>
           <w:rPr>
-            <w:color w:val="795938"/>
+            <w:color w:val="0066CC"/>
           </w:rPr>
-          <w:t>hospitality reference study</w:t>
+          <w:t>implementation plan</w:t>
+        </w:r>
+      </w:hyperlink>
+      <w:r>
+        <w:t xml:space="preserve"> records the frozen design; </w:t>
+      </w:r>
+      <w:hyperlink r:id="rId14">
+        <w:r>
+          <w:rPr>
+            <w:color w:val="0066CC"/>
+          </w:rPr>
+          <w:t>Linear source notes</w:t>
         </w:r>
       </w:hyperlink>
       <w:r>
         <w:t xml:space="preserve">, </w:t>
       </w:r>
-      <w:hyperlink r:id="rId14">
+      <w:hyperlink r:id="rId15">
         <w:r>
           <w:rPr>
-            <w:color w:val="795938"/>
+            <w:color w:val="0066CC"/>
           </w:rPr>
-          <w:t>feature and fact plan</w:t>
+          <w:t>Casa Angelina notes</w:t>
         </w:r>
       </w:hyperlink>
       <w:r>
-        <w:t xml:space="preserve"> and </w:t>
-      </w:r>
-      <w:hyperlink r:id="rId15">
-        <w:r>
-          <w:rPr>
-            <w:color w:val="795938"/>
-          </w:rPr>
-          <w:t>implementation plan</w:t>
-        </w:r>
-      </w:hyperlink>
-      <w:r>
-        <w:t>. Earlier design documents remain historical.</w:t>
+        <w:t xml:space="preserve"> and earlier hotel studies retain research context.</w:t>
       </w:r>
     </w:p>
     <w:p>
@@ -206,7 +214,7 @@
         <w:t>/</w:t>
       </w:r>
       <w:r>
-        <w:t xml:space="preserve"> — genuine-property hero, dated StayBar, welcome, all rooms, dining, city itinerary, an attributed guest excerpt and review links, gallery, arrival, FAQs, guides and a final enquiry.</w:t>
+        <w:t xml:space="preserve"> — property hero, dated StayBar, all rooms, dining, city itinerary, dated Google badge, attributed guest excerpt, proximity links, gallery, arrival, FAQs and guides.</w:t>
       </w:r>
     </w:p>
     <w:p>
@@ -223,7 +231,7 @@
         <w:t>/hotel</w:t>
       </w:r>
       <w:r>
-        <w:t xml:space="preserve"> — the property, reception, facilities and arrival guidance; </w:t>
+        <w:t xml:space="preserve"> — property, facilities and arrival; </w:t>
       </w:r>
       <w:r>
         <w:rPr>
@@ -233,7 +241,17 @@
         <w:t>/dining</w:t>
       </w:r>
       <w:r>
-        <w:t xml:space="preserve"> — vegetarian restaurant, room service and meal-plan enquiries.</w:t>
+        <w:t xml:space="preserve"> — vegetarian dining, its own enquiry and downloadable planning guide; </w:t>
+      </w:r>
+      <w:r>
+        <w:rPr>
+          <w:rFonts w:ascii="Consolas" w:hAnsi="Consolas"/>
+          <w:sz w:val="18"/>
+        </w:rPr>
+        <w:t>/group-stays</w:t>
+      </w:r>
+      <w:r>
+        <w:t xml:space="preserve"> — family, friends and business accommodation requests.</w:t>
       </w:r>
     </w:p>
     <w:p>
@@ -369,7 +387,7 @@
         <w:widowControl/>
       </w:pPr>
       <w:r>
-        <w:t xml:space="preserve">Core facts and contact: </w:t>
+        <w:t xml:space="preserve">Core facts: </w:t>
       </w:r>
       <w:r>
         <w:rPr>
@@ -379,7 +397,7 @@
         <w:t>content/hotel.ts</w:t>
       </w:r>
       <w:r>
-        <w:t xml:space="preserve">. Facilities, review links and arrival: </w:t>
+        <w:t xml:space="preserve">; facilities/arrival: </w:t>
       </w:r>
       <w:r>
         <w:rPr>
@@ -389,7 +407,17 @@
         <w:t>content/hospitality.ts</w:t>
       </w:r>
       <w:r>
-        <w:t xml:space="preserve">. Guides: </w:t>
+        <w:t xml:space="preserve">; dated proof: </w:t>
+      </w:r>
+      <w:r>
+        <w:rPr>
+          <w:rFonts w:ascii="Consolas" w:hAnsi="Consolas"/>
+          <w:sz w:val="18"/>
+        </w:rPr>
+        <w:t>content/social-proof.ts</w:t>
+      </w:r>
+      <w:r>
+        <w:t xml:space="preserve">; guides/photos: </w:t>
       </w:r>
       <w:r>
         <w:rPr>
@@ -399,7 +427,7 @@
         <w:t>content/guides.ts</w:t>
       </w:r>
       <w:r>
-        <w:t xml:space="preserve">. Photos: </w:t>
+        <w:t xml:space="preserve"> and </w:t>
       </w:r>
       <w:r>
         <w:rPr>
@@ -409,17 +437,7 @@
         <w:t>content/room-images.ts</w:t>
       </w:r>
       <w:r>
-        <w:t xml:space="preserve">. Tokens: </w:t>
-      </w:r>
-      <w:r>
-        <w:rPr>
-          <w:rFonts w:ascii="Consolas" w:hAnsi="Consolas"/>
-          <w:sz w:val="18"/>
-        </w:rPr>
-        <w:t>app/globals.css</w:t>
-      </w:r>
-      <w:r>
-        <w:t xml:space="preserve">. Booking validation and WhatsApp URLs: </w:t>
+        <w:t xml:space="preserve">. Booking: </w:t>
       </w:r>
       <w:r>
         <w:rPr>
@@ -429,7 +447,7 @@
         <w:t>lib/booking.ts</w:t>
       </w:r>
       <w:r>
-        <w:t xml:space="preserve">; page-to-page travel preferences: </w:t>
+        <w:t xml:space="preserve">, </w:t>
       </w:r>
       <w:r>
         <w:rPr>
@@ -439,33 +457,32 @@
         <w:t>lib/stay-query.ts</w:t>
       </w:r>
       <w:r>
-        <w:t xml:space="preserve">. The reusable </w:t>
+        <w:t xml:space="preserve">, </w:t>
       </w:r>
       <w:r>
         <w:rPr>
           <w:rFonts w:ascii="Consolas" w:hAnsi="Consolas"/>
           <w:sz w:val="18"/>
         </w:rPr>
-        <w:t>StayBar</w:t>
+        <w:t>lib/dining-enquiry.ts</w:t>
       </w:r>
       <w:r>
-        <w:t xml:space="preserve"> and </w:t>
+        <w:t xml:space="preserve">. The universal </w:t>
       </w:r>
       <w:r>
         <w:rPr>
           <w:rFonts w:ascii="Consolas" w:hAnsi="Consolas"/>
           <w:sz w:val="18"/>
         </w:rPr>
-        <w:t>ArrivalGuide</w:t>
+        <w:t>BookingDock</w:t>
       </w:r>
       <w:r>
-        <w:t xml:space="preserve"> components serve multiple pages. Adapt the enquiry handoff deliberately when adding an approved booking engine.</w:t>
+        <w:t xml:space="preserve"> reserves its measured height through the footer. Stay requests include 1–8 requested rooms and night summaries; these are not capacity promises.</w:t>
       </w:r>
     </w:p>
     <w:p>
       <w:pPr>
         <w:pStyle w:val="Heading1"/>
-        <w:pageBreakBefore/>
         <w:widowControl/>
       </w:pPr>
       <w:r>
@@ -477,7 +494,7 @@
         <w:widowControl/>
       </w:pPr>
       <w:r>
-        <w:t>Research retains 22 source entries covering Google, OTAs, destination authorities and contact verification. The public image set contains 22 WebP files. Property photographs show Hotel Augusto; destination photographs are separately identified. No generated hotel photographs or unrelated room stand-ins are used.</w:t>
+        <w:t>The base ledger retains 22 source entries, supplemented by later verification records. The public image set retains 22 source WebP files plus generated responsive variants. Hotel and destination photographs are clearly distinguished. No generated hotel photographs or unrelated room stand-ins are used.</w:t>
       </w:r>
     </w:p>
     <w:p>
@@ -524,7 +541,7 @@
         <w:widowControl/>
       </w:pPr>
       <w:r>
-        <w:t xml:space="preserve">Destination images use Unsplash licences and a CC BY 4.0 temple photo by Pradum Shukla. Keep the visible temple attribution and </w:t>
+        <w:t xml:space="preserve">Destination images use Unsplash licences and a CC BY 4.0 temple photo by Pradum Shukla. Keep temple attribution and </w:t>
       </w:r>
       <w:r>
         <w:rPr>
@@ -534,7 +551,17 @@
         <w:t>/privacy</w:t>
       </w:r>
       <w:r>
-        <w:t xml:space="preserve"> credits. The Augusto wordmark is an original typographic treatment, not a recovered official logo.</w:t>
+        <w:t xml:space="preserve"> credits. The user supplied </w:t>
+      </w:r>
+      <w:r>
+        <w:rPr>
+          <w:rFonts w:ascii="Consolas" w:hAnsi="Consolas"/>
+          <w:sz w:val="18"/>
+        </w:rPr>
+        <w:t>logo.jpeg</w:t>
+      </w:r>
+      <w:r>
+        <w:t>; its public brand copy now appears in the header, footer, favicon, OG and dining guide.</w:t>
       </w:r>
     </w:p>
     <w:p>
@@ -556,7 +583,7 @@
       <w:hyperlink r:id="rId16">
         <w:r>
           <w:rPr>
-            <w:color w:val="795938"/>
+            <w:color w:val="0066CC"/>
           </w:rPr>
           <w:t>fact sheet</w:t>
         </w:r>
@@ -567,7 +594,7 @@
       <w:hyperlink r:id="rId17">
         <w:r>
           <w:rPr>
-            <w:color w:val="795938"/>
+            <w:color w:val="0066CC"/>
           </w:rPr>
           <w:t>source ledger</w:t>
         </w:r>
@@ -578,7 +605,7 @@
       <w:hyperlink r:id="rId18">
         <w:r>
           <w:rPr>
-            <w:color w:val="795938"/>
+            <w:color w:val="0066CC"/>
           </w:rPr>
           <w:t>asset manifest</w:t>
         </w:r>
@@ -589,7 +616,7 @@
       <w:hyperlink r:id="rId19">
         <w:r>
           <w:rPr>
-            <w:color w:val="795938"/>
+            <w:color w:val="0066CC"/>
           </w:rPr>
           <w:t>Maps verification</w:t>
         </w:r>
@@ -600,7 +627,7 @@
       <w:hyperlink r:id="rId20">
         <w:r>
           <w:rPr>
-            <w:color w:val="795938"/>
+            <w:color w:val="0066CC"/>
           </w:rPr>
           <w:t>WhatsApp verification</w:t>
         </w:r>
@@ -619,7 +646,7 @@
       <w:hyperlink r:id="rId21">
         <w:r>
           <w:rPr>
-            <w:color w:val="795938"/>
+            <w:color w:val="0066CC"/>
           </w:rPr>
           <w:t>OTA source record</w:t>
         </w:r>
@@ -630,20 +657,9 @@
       <w:hyperlink r:id="rId22">
         <w:r>
           <w:rPr>
-            <w:color w:val="795938"/>
+            <w:color w:val="0066CC"/>
           </w:rPr>
           <w:t>photo mapping</w:t>
-        </w:r>
-      </w:hyperlink>
-      <w:r>
-        <w:t xml:space="preserve">, </w:t>
-      </w:r>
-      <w:hyperlink r:id="rId14">
-        <w:r>
-          <w:rPr>
-            <w:color w:val="795938"/>
-          </w:rPr>
-          <w:t>new feature evidence</w:t>
         </w:r>
       </w:hyperlink>
       <w:r>
@@ -652,7 +668,18 @@
       <w:hyperlink r:id="rId23">
         <w:r>
           <w:rPr>
-            <w:color w:val="795938"/>
+            <w:color w:val="0066CC"/>
+          </w:rPr>
+          <w:t>new feature evidence</w:t>
+        </w:r>
+      </w:hyperlink>
+      <w:r>
+        <w:t xml:space="preserve">, </w:t>
+      </w:r>
+      <w:hyperlink r:id="rId24">
+        <w:r>
+          <w:rPr>
+            <w:color w:val="0066CC"/>
           </w:rPr>
           <w:t>guest-excerpt evidence</w:t>
         </w:r>
@@ -660,16 +687,86 @@
       <w:r>
         <w:t xml:space="preserve"> and </w:t>
       </w:r>
-      <w:hyperlink r:id="rId24">
+      <w:hyperlink r:id="rId25">
         <w:r>
           <w:rPr>
-            <w:color w:val="795938"/>
+            <w:color w:val="0066CC"/>
           </w:rPr>
           <w:t>official visitor-link checks</w:t>
         </w:r>
       </w:hyperlink>
       <w:r>
         <w:t>.</w:t>
+      </w:r>
+    </w:p>
+    <w:p>
+      <w:pPr>
+        <w:widowControl/>
+      </w:pPr>
+      <w:r>
+        <w:t xml:space="preserve">Google: 3.7/5 from 1,628 reviews, checked 20 October 2026, displayed with source/date. MMT scores conflict, so its review link carries no numerical badge. No new guest-photo reuse licence was established. Temple/ghat proximity stays qualitative with walking-direction links. </w:t>
+      </w:r>
+      <w:hyperlink r:id="rId26">
+        <w:r>
+          <w:rPr>
+            <w:color w:val="0066CC"/>
+          </w:rPr>
+          <w:t>Fresh findings</w:t>
+        </w:r>
+      </w:hyperlink>
+      <w:r>
+        <w:t xml:space="preserve"> retain these distinctions; no wedding, banquet or conference services are claimed.</w:t>
+      </w:r>
+    </w:p>
+    <w:p>
+      <w:pPr>
+        <w:widowControl/>
+      </w:pPr>
+      <w:r>
+        <w:t xml:space="preserve">The one-page </w:t>
+      </w:r>
+      <w:hyperlink r:id="rId27">
+        <w:r>
+          <w:rPr>
+            <w:color w:val="0066CC"/>
+          </w:rPr>
+          <w:t>dining PDF</w:t>
+        </w:r>
+      </w:hyperlink>
+      <w:r>
+        <w:t xml:space="preserve"> and </w:t>
+      </w:r>
+      <w:hyperlink r:id="rId28">
+        <w:r>
+          <w:rPr>
+            <w:color w:val="0066CC"/>
+          </w:rPr>
+          <w:t>editable DOCX</w:t>
+        </w:r>
+      </w:hyperlink>
+      <w:r>
+        <w:t xml:space="preserve"> use genuine imagery and planning information, not an invented menu. Regenerate with </w:t>
+      </w:r>
+      <w:r>
+        <w:rPr>
+          <w:rFonts w:ascii="Consolas" w:hAnsi="Consolas"/>
+          <w:sz w:val="18"/>
+        </w:rPr>
+        <w:t>python -B scripts/generate_dining_guide.py</w:t>
+      </w:r>
+      <w:r>
+        <w:t xml:space="preserve">; </w:t>
+      </w:r>
+      <w:hyperlink r:id="rId29">
+        <w:r>
+          <w:rPr>
+            <w:color w:val="0066CC"/>
+          </w:rPr>
+          <w:t>render/reopen evidence</w:t>
+        </w:r>
+      </w:hyperlink>
+      <w:r>
+        <w:t xml:space="preserve"> records both outputs.</w:t>
       </w:r>
     </w:p>
     <w:p>
@@ -800,7 +897,7 @@
           <w:rFonts w:ascii="Consolas" w:hAnsi="Consolas"/>
           <w:sz w:val="18"/>
         </w:rPr>
-        <w:t>python scripts/qa_hospitality_revision.py --base-url http://127.0.0.1:3080</w:t>
+        <w:t>npm run qa -- --base-url http://127.0.0.1:3080 --output evidence/apple-dominant-revision</w:t>
       </w:r>
     </w:p>
     <w:p>
@@ -887,7 +984,7 @@
         <w:widowControl/>
       </w:pPr>
       <w:r>
-        <w:t xml:space="preserve">Normal Next.js/Vercel operation is the default. For the private static preview only, set </w:t>
+        <w:t xml:space="preserve">Normal Next/Vercel retains AVIF/WebP optimization. Optional </w:t>
       </w:r>
       <w:r>
         <w:rPr>
@@ -897,17 +994,7 @@
         <w:t>SITE_STATIC_EXPORT=true</w:t>
       </w:r>
       <w:r>
-        <w:t xml:space="preserve"> before </w:t>
-      </w:r>
-      <w:r>
-        <w:rPr>
-          <w:rFonts w:ascii="Consolas" w:hAnsi="Consolas"/>
-          <w:sz w:val="18"/>
-        </w:rPr>
-        <w:t>npm run build</w:t>
-      </w:r>
-      <w:r>
-        <w:t xml:space="preserve">; the result is </w:t>
+        <w:t xml:space="preserve"> writes </w:t>
       </w:r>
       <w:r>
         <w:rPr>
@@ -917,7 +1004,27 @@
         <w:t>out/</w:t>
       </w:r>
       <w:r>
-        <w:t>. Unset the flag for the next normal build. Static export disables server image optimization; the static host must supply response headers. Keep previews noindex and verify their deployed behavior.</w:t>
+        <w:t xml:space="preserve"> using </w:t>
+      </w:r>
+      <w:r>
+        <w:rPr>
+          <w:rFonts w:ascii="Consolas" w:hAnsi="Consolas"/>
+          <w:sz w:val="18"/>
+        </w:rPr>
+        <w:t>lib/static-image-loader.ts</w:t>
+      </w:r>
+      <w:r>
+        <w:t xml:space="preserve"> and local WebP variants. After changing photographs, run </w:t>
+      </w:r>
+      <w:r>
+        <w:rPr>
+          <w:rFonts w:ascii="Consolas" w:hAnsi="Consolas"/>
+          <w:sz w:val="18"/>
+        </w:rPr>
+        <w:t>python -B scripts/generate-responsive-images.py</w:t>
+      </w:r>
+      <w:r>
+        <w:t>; preserve originals and the manifest. Unset the export flag for a normal build. The static host supplies response headers; previews remain noindex.</w:t>
       </w:r>
     </w:p>
     <w:p>
@@ -932,7 +1039,6 @@
     <w:p>
       <w:pPr>
         <w:pStyle w:val="Heading1"/>
-        <w:pageBreakBefore/>
         <w:widowControl/>
       </w:pPr>
       <w:r>
@@ -946,16 +1052,16 @@
       <w:r>
         <w:t xml:space="preserve">Latest completed shared report: </w:t>
       </w:r>
-      <w:hyperlink r:id="rId25">
+      <w:hyperlink r:id="rId30">
         <w:r>
           <w:rPr>
-            <w:color w:val="795938"/>
+            <w:color w:val="0066CC"/>
           </w:rPr>
-          <w:t>evidence/hospitality-revision/production-qa.json</w:t>
+          <w:t>evidence/apple-dominant-revision/production-qa.json</w:t>
         </w:r>
       </w:hyperlink>
       <w:r>
-        <w:t xml:space="preserve">, completed 2026-10-20T05:58:42.349172+00:00 against </w:t>
+        <w:t xml:space="preserve">, completed 2026-10-20T07:25:36.282700+00:00 against </w:t>
       </w:r>
       <w:r>
         <w:rPr>
@@ -965,7 +1071,7 @@
         <w:t>http://127.0.0.1:3080</w:t>
       </w:r>
       <w:r>
-        <w:t>. Status: PASS. It records 102 viewport checks, 34 axe audits, 40 interaction checks and 0 failures. These are report counts, not a claim that an unrecorded final run passed.</w:t>
+        <w:t>. Status: PASS. It records 108 viewport checks, 36 axe audits, 40 interaction checks and 0 failures. These are report counts, not a claim that an unrecorded final run passed.</w:t>
       </w:r>
     </w:p>
     <w:p>
@@ -973,7 +1079,18 @@
         <w:widowControl/>
       </w:pPr>
       <w:r>
-        <w:t>The refreshed production audit is dated 2026-10-20T06:00:16.943938+00:00; its OG image is 1200 × 630px. Throttled mobile samples: LCP 1780ms / CLS 0.0000; LCP 1728ms / CLS 0.0000. These are local synthetic measurements, not field Core Web Vitals or a Lighthouse score. The audit retains response headers and runtime observations.</w:t>
+        <w:t xml:space="preserve">Original focused </w:t>
+      </w:r>
+      <w:hyperlink r:id="rId31">
+        <w:r>
+          <w:rPr>
+            <w:color w:val="0066CC"/>
+          </w:rPr>
+          <w:t>conversion QA</w:t>
+        </w:r>
+      </w:hyperlink>
+      <w:r>
+        <w:t>, completed 2026-10-20T07:27:37.930214+00:00: 209 of 211 checks passed; 2 assertions failed. Its scope covers persistent booking access, requested rooms, enquiry drafts, downloads and responsive static media. The original report is retained without rewriting its counts.</w:t>
       </w:r>
     </w:p>
     <w:p>
@@ -981,18 +1098,77 @@
         <w:widowControl/>
       </w:pPr>
       <w:r>
-        <w:t xml:space="preserve">Focused hotel/dining review: 4 route/viewport records at 390, 1440px and 16 interactions; checks pass. Screenshots and the activated Hotel Augusto map pin were visually inspected. This focused dev check supplements the production report. Evidence: </w:t>
+        <w:t xml:space="preserve">Separate </w:t>
       </w:r>
-      <w:hyperlink r:id="rId26">
+      <w:hyperlink r:id="rId32">
         <w:r>
           <w:rPr>
-            <w:color w:val="795938"/>
+            <w:color w:val="0066CC"/>
           </w:rPr>
-          <w:t>page review</w:t>
+          <w:t>dining retest</w:t>
         </w:r>
       </w:hyperlink>
       <w:r>
-        <w:t>.</w:t>
+        <w:t xml:space="preserve">, completed 2026-10-20T07:30:21.949581+00:00: PASS, 13 of 13 checks passed and 0 failed. The original PDF assertions expected the wrong title. The corrected check validates the actual brochure text and downloaded/source SHA256; the brochure did not require a content change. The supplemental report confirms the original report remains byte-identical; its baseline SHA256 is </w:t>
+      </w:r>
+      <w:r>
+        <w:rPr>
+          <w:rFonts w:ascii="Consolas" w:hAnsi="Consolas"/>
+          <w:sz w:val="18"/>
+        </w:rPr>
+        <w:t>e461ad27174be77d22045182d937008daa2d90fd65d0b86b797b4ba8fccb76b8</w:t>
+      </w:r>
+      <w:r>
+        <w:t>. These targeted results are separate from the original full-run totals.</w:t>
+      </w:r>
+    </w:p>
+    <w:p>
+      <w:pPr>
+        <w:widowControl/>
+      </w:pPr>
+      <w:r>
+        <w:t xml:space="preserve">The separate </w:t>
+      </w:r>
+      <w:hyperlink r:id="rId33">
+        <w:r>
+          <w:rPr>
+            <w:color w:val="0066CC"/>
+          </w:rPr>
+          <w:t>room review</w:t>
+        </w:r>
+      </w:hyperlink>
+      <w:r>
+        <w:t xml:space="preserve"> records 21 layouts, 10 axe audits, 29 interactions and 0 failures. The </w:t>
+      </w:r>
+      <w:hyperlink r:id="rId34">
+        <w:r>
+          <w:rPr>
+            <w:color w:val="0066CC"/>
+          </w:rPr>
+          <w:t>static-export audit</w:t>
+        </w:r>
+      </w:hyperlink>
+      <w:r>
+        <w:t xml:space="preserve"> records 64/64 checks passed across 17 content routes and the not-found artifact. The </w:t>
+      </w:r>
+      <w:hyperlink r:id="rId35">
+        <w:r>
+          <w:rPr>
+            <w:color w:val="0066CC"/>
+          </w:rPr>
+          <w:t>visual capture record</w:t>
+        </w:r>
+      </w:hyperlink>
+      <w:r>
+        <w:t xml:space="preserve"> contains 46 captures and 0 capture errors.</w:t>
+      </w:r>
+    </w:p>
+    <w:p>
+      <w:pPr>
+        <w:widowControl/>
+      </w:pPr>
+      <w:r>
+        <w:t>The refreshed production audit is dated 2026-10-20T07:29:12.879370+00:00; its OG image is 1200 × 630px. Throttled mobile samples: LCP 1624ms / CLS 0.0000; LCP 1692ms / CLS 0.0000. These are local synthetic measurements, not field Core Web Vitals or a Lighthouse score. The audit retains response headers and runtime observations.</w:t>
       </w:r>
     </w:p>
     <w:p>
@@ -1007,7 +1183,7 @@
           <w:rFonts w:ascii="Consolas" w:hAnsi="Consolas"/>
           <w:sz w:val="18"/>
         </w:rPr>
-        <w:t>evidence/hospitality-revision/</w:t>
+        <w:t>evidence/apple-dominant-revision/</w:t>
       </w:r>
       <w:r>
         <w:t xml:space="preserve">; the final report is </w:t>
@@ -1017,10 +1193,10 @@
           <w:rFonts w:ascii="Consolas" w:hAnsi="Consolas"/>
           <w:sz w:val="18"/>
         </w:rPr>
-        <w:t>evidence/hospitality-revision/production-qa.json</w:t>
+        <w:t>production-qa.json</w:t>
       </w:r>
       <w:r>
-        <w:t>. Earlier Apple/cinematic reports remain history. Browser checks do not establish hotel policy accuracy, live availability or photo rights.</w:t>
+        <w:t>. Earlier hospitality, Apple and cinematic reports and deployment receipts remain historical. Browser checks do not establish hotel policy accuracy, live availability or photo rights.</w:t>
       </w:r>
     </w:p>
     <w:p>
@@ -1030,10 +1206,10 @@
       <w:r>
         <w:t xml:space="preserve">Release evidence: </w:t>
       </w:r>
-      <w:hyperlink r:id="rId27">
+      <w:hyperlink r:id="rId36">
         <w:r>
           <w:rPr>
-            <w:color w:val="795938"/>
+            <w:color w:val="0066CC"/>
           </w:rPr>
           <w:t>production audit</w:t>
         </w:r>
@@ -1041,27 +1217,38 @@
       <w:r>
         <w:t xml:space="preserve">, </w:t>
       </w:r>
-      <w:hyperlink r:id="rId28">
+      <w:hyperlink r:id="rId34">
         <w:r>
           <w:rPr>
-            <w:color w:val="795938"/>
+            <w:color w:val="0066CC"/>
           </w:rPr>
-          <w:t>scoped storage cleanup</w:t>
+          <w:t>static-export audit</w:t>
         </w:r>
       </w:hyperlink>
       <w:r>
-        <w:t xml:space="preserve">, and </w:t>
+        <w:t xml:space="preserve">, </w:t>
       </w:r>
-      <w:hyperlink r:id="rId29">
+      <w:hyperlink r:id="rId37">
         <w:r>
           <w:rPr>
-            <w:color w:val="795938"/>
+            <w:color w:val="0066CC"/>
           </w:rPr>
-          <w:t>inactive development output cleanup</w:t>
+          <w:t>this revision's cleanup</w:t>
         </w:r>
       </w:hyperlink>
       <w:r>
-        <w:t>. The development cleanup records 290,643,233 bytes removed after stopping the dev session; production was verified afterwards. The local preview remains noindex. An approved public domain and route canonical configuration still require launch verification.</w:t>
+        <w:t xml:space="preserve"> and </w:t>
+      </w:r>
+      <w:hyperlink r:id="rId12">
+        <w:r>
+          <w:rPr>
+            <w:color w:val="0066CC"/>
+          </w:rPr>
+          <w:t>private deployment status</w:t>
+        </w:r>
+      </w:hyperlink>
+      <w:r>
+        <w:t>. Historical storage and development-output records remain preserved. The preview stays noindex. An approved public domain and route canonical configuration still require launch verification.</w:t>
       </w:r>
     </w:p>
     <w:p>
@@ -1126,10 +1313,10 @@
       <w:r>
         <w:t xml:space="preserve">The recorded production dependency audit has 0 vulnerabilities. The full audit records 5 high findings from one development-only ESLint chain ending in braces 3.0.3. </w:t>
       </w:r>
-      <w:hyperlink r:id="rId30">
+      <w:hyperlink r:id="rId38">
         <w:r>
           <w:rPr>
-            <w:color w:val="795938"/>
+            <w:color w:val="0066CC"/>
           </w:rPr>
           <w:t>GHSA-vfj7-8cjw-p6xm</w:t>
         </w:r>
@@ -1137,10 +1324,10 @@
       <w:r>
         <w:t xml:space="preserve"> had no official patched release at the 19 October 2026 review. Keep the lockfile, recheck upstream and do not force-downgrade Next.js to silence it. Details: </w:t>
       </w:r>
-      <w:hyperlink r:id="rId31">
+      <w:hyperlink r:id="rId39">
         <w:r>
           <w:rPr>
-            <w:color w:val="795938"/>
+            <w:color w:val="0066CC"/>
           </w:rPr>
           <w:t>security review</w:t>
         </w:r>
@@ -1154,7 +1341,25 @@
         <w:widowControl/>
       </w:pPr>
       <w:r>
-        <w:t>StayBar passes validated dates, party size and room preference through the contact URL; these may remain in browser history. Names and personal notes stay off that URL. The form prepares a WhatsApp draft without saving enquiries or sending silently. The Google map iframe loads only on explicit activation. No payment collection or analytics is installed. Security headers, Hotel JSON-LD, local fonts and a 1200×630 OG image are included. Privacy must be revisited when these features change.</w:t>
+        <w:t>StayBar/dock pass dates, party size, requested room count and preference through the contact URL; these may remain in browser history. Names and personal notes stay off that URL. On contact, dock submission retains current room/count/children and applies the dock's dates/adults. Query changes update the existing form without remounting it, preserve unfinished name/notes and clear stale errors and prepared drafts. Stay/group/dining forms prepare explicit WhatsApp drafts without storage or silent sending. The map loads only on activation. No payments or analytics are installed. Preserve security headers, Hotel JSON-LD, local fonts and OG metadata.</w:t>
+      </w:r>
+    </w:p>
+    <w:p>
+      <w:pPr>
+        <w:widowControl/>
+      </w:pPr>
+      <w:r>
+        <w:t xml:space="preserve">Tailwind uses </w:t>
+      </w:r>
+      <w:r>
+        <w:rPr>
+          <w:rFonts w:ascii="Consolas" w:hAnsi="Consolas"/>
+          <w:sz w:val="18"/>
+        </w:rPr>
+        <w:t>source(none)</w:t>
+      </w:r>
+      <w:r>
+        <w:t xml:space="preserve"> with explicit app/components/content paths. Preserve that scan boundary: a previous broad scan panicked on a transient Word file during hot development. Generated documents and research are excluded.</w:t>
       </w:r>
     </w:p>
     <w:p>
@@ -1171,12 +1376,56 @@
         <w:widowControl/>
       </w:pPr>
       <w:r>
-        <w:t xml:space="preserve">Design: </w:t>
+        <w:t xml:space="preserve">Visual hierarchy: </w:t>
       </w:r>
-      <w:hyperlink r:id="rId32">
+      <w:hyperlink r:id="rId40">
         <w:r>
           <w:rPr>
-            <w:color w:val="795938"/>
+            <w:color w:val="0066CC"/>
+          </w:rPr>
+          <w:t>Lando Norris</w:t>
+        </w:r>
+      </w:hyperlink>
+      <w:r>
+        <w:t xml:space="preserve">, </w:t>
+      </w:r>
+      <w:hyperlink r:id="rId41">
+        <w:r>
+          <w:rPr>
+            <w:color w:val="0066CC"/>
+          </w:rPr>
+          <w:t>Apple</w:t>
+        </w:r>
+      </w:hyperlink>
+      <w:r>
+        <w:t xml:space="preserve">, </w:t>
+      </w:r>
+      <w:hyperlink r:id="rId42">
+        <w:r>
+          <w:rPr>
+            <w:color w:val="0066CC"/>
+          </w:rPr>
+          <w:t>Linear</w:t>
+        </w:r>
+      </w:hyperlink>
+      <w:r>
+        <w:t xml:space="preserve">. Hospitality: </w:t>
+      </w:r>
+      <w:hyperlink r:id="rId43">
+        <w:r>
+          <w:rPr>
+            <w:color w:val="0066CC"/>
+          </w:rPr>
+          <w:t>Casa Angelina</w:t>
+        </w:r>
+      </w:hyperlink>
+      <w:r>
+        <w:t xml:space="preserve">, </w:t>
+      </w:r>
+      <w:hyperlink r:id="rId44">
+        <w:r>
+          <w:rPr>
+            <w:color w:val="0066CC"/>
           </w:rPr>
           <w:t>Hotel Vagmi</w:t>
         </w:r>
@@ -1184,75 +1433,43 @@
       <w:r>
         <w:t xml:space="preserve">, </w:t>
       </w:r>
-      <w:hyperlink r:id="rId33">
+      <w:hyperlink r:id="rId45">
         <w:r>
           <w:rPr>
-            <w:color w:val="795938"/>
+            <w:color w:val="0066CC"/>
           </w:rPr>
           <w:t>The Drake on Awwwards</w:t>
         </w:r>
       </w:hyperlink>
       <w:r>
-        <w:t xml:space="preserve">, plus Shree Ganesha Palace and live reference captures in </w:t>
+        <w:t xml:space="preserve">. Facts: </w:t>
       </w:r>
-      <w:r>
-        <w:rPr>
-          <w:rFonts w:ascii="Consolas" w:hAnsi="Consolas"/>
-          <w:sz w:val="18"/>
-        </w:rPr>
-        <w:t>research/hospitality-revision/</w:t>
-      </w:r>
-      <w:r>
-        <w:t xml:space="preserve">. Property: </w:t>
-      </w:r>
-      <w:hyperlink r:id="rId34">
+      <w:hyperlink r:id="rId46">
         <w:r>
           <w:rPr>
-            <w:color w:val="795938"/>
+            <w:color w:val="0066CC"/>
           </w:rPr>
-          <w:t>MakeMyTrip Hotel Augusto</w:t>
-        </w:r>
-      </w:hyperlink>
-      <w:r>
-        <w:t xml:space="preserve">. Destination: </w:t>
-      </w:r>
-      <w:hyperlink r:id="rId35">
-        <w:r>
-          <w:rPr>
-            <w:color w:val="795938"/>
-          </w:rPr>
-          <w:t>official temple visitor portal</w:t>
+          <w:t>MakeMyTrip</w:t>
         </w:r>
       </w:hyperlink>
       <w:r>
         <w:t xml:space="preserve">, </w:t>
       </w:r>
-      <w:hyperlink r:id="rId36">
+      <w:hyperlink r:id="rId47">
         <w:r>
           <w:rPr>
-            <w:color w:val="795938"/>
+            <w:color w:val="0066CC"/>
           </w:rPr>
-          <w:t>Kashi Vishwanath government page</w:t>
-        </w:r>
-      </w:hyperlink>
-      <w:r>
-        <w:t xml:space="preserve">, </w:t>
-      </w:r>
-      <w:hyperlink r:id="rId37">
-        <w:r>
-          <w:rPr>
-            <w:color w:val="795938"/>
-          </w:rPr>
-          <w:t>Dashashwamedh Ghat</w:t>
+          <w:t>temple visitor portal</w:t>
         </w:r>
       </w:hyperlink>
       <w:r>
         <w:t xml:space="preserve">. Credits: </w:t>
       </w:r>
-      <w:hyperlink r:id="rId38">
+      <w:hyperlink r:id="rId48">
         <w:r>
           <w:rPr>
-            <w:color w:val="795938"/>
+            <w:color w:val="0066CC"/>
           </w:rPr>
           <w:t>Pradum Shukla temple photo</w:t>
         </w:r>
@@ -1260,10 +1477,10 @@
       <w:r>
         <w:t xml:space="preserve">, </w:t>
       </w:r>
-      <w:hyperlink r:id="rId39">
+      <w:hyperlink r:id="rId49">
         <w:r>
           <w:rPr>
-            <w:color w:val="795938"/>
+            <w:color w:val="0066CC"/>
           </w:rPr>
           <w:t>CC BY 4.0</w:t>
         </w:r>
@@ -1271,10 +1488,10 @@
       <w:r>
         <w:t xml:space="preserve">, </w:t>
       </w:r>
-      <w:hyperlink r:id="rId40">
+      <w:hyperlink r:id="rId50">
         <w:r>
           <w:rPr>
-            <w:color w:val="795938"/>
+            <w:color w:val="0066CC"/>
           </w:rPr>
           <w:t>Unsplash licence</w:t>
         </w:r>
@@ -1289,10 +1506,10 @@
       </w:pPr>
       <w:r>
         <w:rPr>
-          <w:color w:val="69645C"/>
+          <w:color w:val="62656B"/>
           <w:sz w:val="16"/>
         </w:rPr>
-        <w:t>Regenerate both handoff files with: python scripts/generate_handoff.py. The generator uses python-docx and verifies that its DOCX can be reopened.</w:t>
+        <w:t>Regenerate both handoff files with: python -B scripts/generate_handoff.py. The generator uses python-docx and verifies that its DOCX can be reopened.</w:t>
       </w:r>
     </w:p>
     <w:sectPr>
@@ -1333,7 +1550,7 @@
     </w:pPr>
     <w:r>
       <w:rPr>
-        <w:color w:val="69645C"/>
+        <w:color w:val="62656B"/>
         <w:sz w:val="16"/>
       </w:rPr>
       <w:t>DIGIOCULAR  /  HOTEL AUGUSTO</w:t>
@@ -1710,7 +1927,7 @@
     </w:pPr>
     <w:rPr>
       <w:rFonts w:ascii="Arial" w:hAnsi="Arial"/>
-      <w:color w:val="25313D"/>
+      <w:color w:val="25262A"/>
       <w:sz w:val="21"/>
     </w:rPr>
   </w:style>
@@ -1776,7 +1993,7 @@
       <w:rFonts w:asciiTheme="majorHAnsi" w:eastAsiaTheme="majorEastAsia" w:hAnsiTheme="majorHAnsi" w:cstheme="majorBidi" w:ascii="Arial" w:hAnsi="Arial"/>
       <w:b/>
       <w:bCs/>
-      <w:color w:val="25313D"/>
+      <w:color w:val="25262A"/>
       <w:sz w:val="28"/>
       <w:szCs w:val="28"/>
     </w:rPr>
@@ -2064,7 +2281,7 @@
     <w:rPr>
       <w:rFonts w:asciiTheme="majorHAnsi" w:eastAsiaTheme="majorEastAsia" w:hAnsiTheme="majorHAnsi" w:cstheme="majorBidi" w:ascii="Arial" w:hAnsi="Arial"/>
       <w:b/>
-      <w:color w:val="25313D"/>
+      <w:color w:val="25262A"/>
       <w:spacing w:val="5"/>
       <w:kern w:val="28"/>
       <w:sz w:val="60"/>
@@ -2103,7 +2320,7 @@
       <w:rFonts w:asciiTheme="majorHAnsi" w:eastAsiaTheme="majorEastAsia" w:hAnsiTheme="majorHAnsi" w:cstheme="majorBidi" w:ascii="Arial" w:hAnsi="Arial"/>
       <w:i w:val="0"/>
       <w:iCs/>
-      <w:color w:val="25313D"/>
+      <w:color w:val="25262A"/>
       <w:spacing w:val="15"/>
       <w:sz w:val="26"/>
       <w:szCs w:val="24"/>
@@ -2245,7 +2462,7 @@
     </w:pPr>
     <w:rPr>
       <w:rFonts w:ascii="Arial" w:hAnsi="Arial"/>
-      <w:color w:val="25313D"/>
+      <w:color w:val="25262A"/>
     </w:rPr>
   </w:style>
   <w:style w:type="paragraph" w:styleId="ListBullet2">

</xml_diff>